<commit_message>
Correct Julian's service branch to Marine Corps
Co-Authored-By: Claude Opus 4.8 <noreply@anthropic.com>
</commit_message>
<xml_diff>
--- a/Build docs/BestDirectSolutions - Site Build Out.docx
+++ b/Build docs/BestDirectSolutions - Site Build Out.docx
@@ -345,6 +345,101 @@
           <w:color w:val="CC0000"/>
         </w:rPr>
         <w:t>Differentiator #3 — NOT PROVIDED</w:t>
+      </w:r>
+    </w:p>
+    <w:p>
+      <w:pPr>
+        <w:rPr>
+          <w:color w:val="CC0000"/>
+        </w:rPr>
+      </w:pPr>
+    </w:p>
+    <w:p>
+      <w:pPr>
+        <w:rPr>
+          <w:color w:val="CC0000"/>
+        </w:rPr>
+      </w:pPr>
+      <w:r>
+        <w:rPr>
+          <w:color w:val="CC0000"/>
+        </w:rPr>
+        <w:t xml:space="preserve">Tech Stack: </w:t>
+      </w:r>
+    </w:p>
+    <w:p>
+      <w:pPr>
+        <w:rPr>
+          <w:color w:val="CC0000"/>
+        </w:rPr>
+      </w:pPr>
+      <w:r>
+        <w:rPr>
+          <w:color w:val="CC0000"/>
+        </w:rPr>
+        <w:t xml:space="preserve">GitHub: </w:t>
+      </w:r>
+      <w:hyperlink r:id="rId6" w:history="1">
+        <w:r>
+          <w:rPr>
+            <w:rStyle w:val="Hyperlink"/>
+          </w:rPr>
+          <w:t>webdesign.jullianjames@gmail.com</w:t>
+        </w:r>
+      </w:hyperlink>
+      <w:r>
+        <w:t xml:space="preserve"> </w:t>
+      </w:r>
+      <w:r>
+        <w:t xml:space="preserve">| </w:t>
+      </w:r>
+      <w:r>
+        <w:t>Bestsolutions4you2026</w:t>
+      </w:r>
+      <w:r>
+        <w:t xml:space="preserve"> </w:t>
+      </w:r>
+      <w:r>
+        <w:rPr>
+          <w:color w:val="CC0000"/>
+        </w:rPr>
+        <w:t xml:space="preserve"> </w:t>
+      </w:r>
+    </w:p>
+    <w:p>
+      <w:pPr>
+        <w:rPr>
+          <w:color w:val="CC0000"/>
+        </w:rPr>
+      </w:pPr>
+      <w:r>
+        <w:rPr>
+          <w:color w:val="CC0000"/>
+        </w:rPr>
+        <w:t xml:space="preserve">Netlify: </w:t>
+      </w:r>
+      <w:hyperlink r:id="rId7" w:history="1">
+        <w:r>
+          <w:rPr>
+            <w:rStyle w:val="Hyperlink"/>
+          </w:rPr>
+          <w:t>webdesign.jullianjames@gmail.com</w:t>
+        </w:r>
+      </w:hyperlink>
+      <w:r>
+        <w:t xml:space="preserve"> | </w:t>
+      </w:r>
+      <w:r>
+        <w:t>Bestsolutions4you2026</w:t>
+      </w:r>
+      <w:r>
+        <w:t xml:space="preserve"> </w:t>
+      </w:r>
+      <w:r>
+        <w:rPr>
+          <w:color w:val="CC0000"/>
+        </w:rPr>
+        <w:t xml:space="preserve"> </w:t>
       </w:r>
     </w:p>
     <w:p>

</xml_diff>

<commit_message>
Update the build docs
Co-Authored-By: Claude Opus 4.8 <noreply@anthropic.com>
</commit_message>
<xml_diff>
--- a/Build docs/BestDirectSolutions - Site Build Out.docx
+++ b/Build docs/BestDirectSolutions - Site Build Out.docx
@@ -388,10 +388,7 @@
         </w:r>
       </w:hyperlink>
       <w:r>
-        <w:t xml:space="preserve"> </w:t>
-      </w:r>
-      <w:r>
-        <w:t xml:space="preserve">| </w:t>
+        <w:t xml:space="preserve"> | </w:t>
       </w:r>
       <w:r>
         <w:t>Bestsolutions4you2026</w:t>
@@ -455,30 +452,1163 @@
           <w:color w:val="CC0000"/>
         </w:rPr>
       </w:pPr>
-    </w:p>
-    <w:p>
-      <w:pPr>
-        <w:rPr>
-          <w:color w:val="CC0000"/>
-        </w:rPr>
-      </w:pPr>
-    </w:p>
-    <w:p>
-      <w:pPr>
-        <w:rPr>
-          <w:color w:val="CC0000"/>
-        </w:rPr>
-      </w:pPr>
-    </w:p>
-    <w:p>
-      <w:pPr>
-        <w:rPr>
-          <w:color w:val="CC0000"/>
-        </w:rPr>
-      </w:pPr>
-    </w:p>
-    <w:p>
-      <w:pPr>
+      <w:r>
+        <w:rPr>
+          <w:color w:val="CC0000"/>
+        </w:rPr>
+        <w:t xml:space="preserve">New email: </w:t>
+      </w:r>
+      <w:hyperlink r:id="rId8" w:history="1">
+        <w:r>
+          <w:rPr>
+            <w:rStyle w:val="Hyperlink"/>
+          </w:rPr>
+          <w:t>Design.Bestsolutions4u@gmail.com</w:t>
+        </w:r>
+      </w:hyperlink>
+      <w:r>
+        <w:rPr>
+          <w:color w:val="CC0000"/>
+        </w:rPr>
+        <w:t xml:space="preserve"> | Admin</w:t>
+      </w:r>
+      <w:r>
+        <w:rPr>
+          <w:color w:val="CC0000"/>
+        </w:rPr>
+        <w:t>.bestsolutions4u26</w:t>
+      </w:r>
+    </w:p>
+    <w:p>
+      <w:pPr>
+        <w:rPr>
+          <w:color w:val="CC0000"/>
+        </w:rPr>
+      </w:pPr>
+    </w:p>
+    <w:p>
+      <w:pPr>
+        <w:rPr>
+          <w:color w:val="CC0000"/>
+        </w:rPr>
+      </w:pPr>
+    </w:p>
+    <w:p>
+      <w:pPr>
+        <w:rPr>
+          <w:color w:val="CC0000"/>
+        </w:rPr>
+      </w:pPr>
+    </w:p>
+    <w:p>
+      <w:pPr>
+        <w:rPr>
+          <w:color w:val="CC0000"/>
+        </w:rPr>
+      </w:pPr>
+    </w:p>
+    <w:p>
+      <w:pPr>
+        <w:rPr>
+          <w:color w:val="CC0000"/>
+        </w:rPr>
+      </w:pPr>
+    </w:p>
+    <w:p>
+      <w:pPr>
+        <w:pStyle w:val="ListParagraph"/>
+        <w:ind w:left="405"/>
+        <w:rPr>
+          <w:b/>
+          <w:bCs/>
+          <w:color w:val="CC0000"/>
+        </w:rPr>
+      </w:pPr>
+      <w:r>
+        <w:rPr>
+          <w:b/>
+          <w:bCs/>
+          <w:color w:val="CC0000"/>
+        </w:rPr>
+        <w:t>Website Handoff Checklist</w:t>
+      </w:r>
+    </w:p>
+    <w:p>
+      <w:pPr>
+        <w:pStyle w:val="ListParagraph"/>
+        <w:ind w:left="405"/>
+        <w:rPr>
+          <w:b/>
+          <w:bCs/>
+          <w:color w:val="CC0000"/>
+        </w:rPr>
+      </w:pPr>
+      <w:r>
+        <w:rPr>
+          <w:b/>
+          <w:bCs/>
+          <w:color w:val="CC0000"/>
+        </w:rPr>
+        <w:t>Account Ownership Transfer</w:t>
+      </w:r>
+    </w:p>
+    <w:p>
+      <w:pPr>
+        <w:pStyle w:val="ListParagraph"/>
+        <w:numPr>
+          <w:ilvl w:val="0"/>
+          <w:numId w:val="4"/>
+        </w:numPr>
+        <w:rPr>
+          <w:color w:val="CC0000"/>
+        </w:rPr>
+      </w:pPr>
+      <w:r>
+        <w:rPr>
+          <w:color w:val="CC0000"/>
+        </w:rPr>
+        <w:t xml:space="preserve">Create or update the primary account to </w:t>
+      </w:r>
+      <w:r>
+        <w:rPr>
+          <w:b/>
+          <w:bCs/>
+          <w:color w:val="CC0000"/>
+        </w:rPr>
+        <w:t>admin.bestsolutions4u@gmail.com</w:t>
+      </w:r>
+      <w:r>
+        <w:rPr>
+          <w:color w:val="CC0000"/>
+        </w:rPr>
+        <w:t xml:space="preserve"> </w:t>
+      </w:r>
+    </w:p>
+    <w:p>
+      <w:pPr>
+        <w:pStyle w:val="ListParagraph"/>
+        <w:numPr>
+          <w:ilvl w:val="0"/>
+          <w:numId w:val="4"/>
+        </w:numPr>
+        <w:rPr>
+          <w:color w:val="CC0000"/>
+        </w:rPr>
+      </w:pPr>
+      <w:r>
+        <w:rPr>
+          <w:color w:val="CC0000"/>
+        </w:rPr>
+        <w:t xml:space="preserve">Transfer ownership and/or access for: </w:t>
+      </w:r>
+    </w:p>
+    <w:p>
+      <w:pPr>
+        <w:pStyle w:val="ListParagraph"/>
+        <w:numPr>
+          <w:ilvl w:val="1"/>
+          <w:numId w:val="4"/>
+        </w:numPr>
+        <w:rPr>
+          <w:color w:val="CC0000"/>
+        </w:rPr>
+      </w:pPr>
+      <w:r>
+        <w:rPr>
+          <w:color w:val="CC0000"/>
+        </w:rPr>
+        <w:t xml:space="preserve">GitHub Repository </w:t>
+      </w:r>
+    </w:p>
+    <w:p>
+      <w:pPr>
+        <w:pStyle w:val="ListParagraph"/>
+        <w:numPr>
+          <w:ilvl w:val="1"/>
+          <w:numId w:val="4"/>
+        </w:numPr>
+        <w:rPr>
+          <w:color w:val="CC0000"/>
+        </w:rPr>
+      </w:pPr>
+      <w:r>
+        <w:rPr>
+          <w:color w:val="CC0000"/>
+        </w:rPr>
+        <w:t xml:space="preserve">Gmail Account </w:t>
+      </w:r>
+    </w:p>
+    <w:p>
+      <w:pPr>
+        <w:pStyle w:val="ListParagraph"/>
+        <w:numPr>
+          <w:ilvl w:val="1"/>
+          <w:numId w:val="4"/>
+        </w:numPr>
+        <w:rPr>
+          <w:color w:val="CC0000"/>
+        </w:rPr>
+      </w:pPr>
+      <w:r>
+        <w:rPr>
+          <w:color w:val="CC0000"/>
+        </w:rPr>
+        <w:t xml:space="preserve">Netlify Project </w:t>
+      </w:r>
+    </w:p>
+    <w:p>
+      <w:pPr>
+        <w:pStyle w:val="ListParagraph"/>
+        <w:numPr>
+          <w:ilvl w:val="0"/>
+          <w:numId w:val="4"/>
+        </w:numPr>
+        <w:rPr>
+          <w:color w:val="CC0000"/>
+        </w:rPr>
+      </w:pPr>
+      <w:r>
+        <w:rPr>
+          <w:color w:val="CC0000"/>
+        </w:rPr>
+        <w:t xml:space="preserve">Confirm the new owner has full administrative permissions. </w:t>
+      </w:r>
+    </w:p>
+    <w:p>
+      <w:pPr>
+        <w:pStyle w:val="ListParagraph"/>
+        <w:ind w:left="405"/>
+        <w:rPr>
+          <w:b/>
+          <w:bCs/>
+          <w:color w:val="CC0000"/>
+        </w:rPr>
+      </w:pPr>
+      <w:r>
+        <w:rPr>
+          <w:b/>
+          <w:bCs/>
+          <w:color w:val="CC0000"/>
+        </w:rPr>
+        <w:t>Project Deliverables</w:t>
+      </w:r>
+    </w:p>
+    <w:p>
+      <w:pPr>
+        <w:pStyle w:val="ListParagraph"/>
+        <w:numPr>
+          <w:ilvl w:val="0"/>
+          <w:numId w:val="5"/>
+        </w:numPr>
+        <w:rPr>
+          <w:color w:val="CC0000"/>
+        </w:rPr>
+      </w:pPr>
+      <w:r>
+        <w:rPr>
+          <w:color w:val="CC0000"/>
+        </w:rPr>
+        <w:t xml:space="preserve">Complete all remaining deliverables outlined in the Claude project documentation. </w:t>
+      </w:r>
+    </w:p>
+    <w:p>
+      <w:pPr>
+        <w:pStyle w:val="ListParagraph"/>
+        <w:numPr>
+          <w:ilvl w:val="0"/>
+          <w:numId w:val="5"/>
+        </w:numPr>
+        <w:rPr>
+          <w:color w:val="CC0000"/>
+        </w:rPr>
+      </w:pPr>
+      <w:r>
+        <w:rPr>
+          <w:color w:val="CC0000"/>
+        </w:rPr>
+        <w:t xml:space="preserve">Provide a complete copy of the project, including: </w:t>
+      </w:r>
+    </w:p>
+    <w:p>
+      <w:pPr>
+        <w:pStyle w:val="ListParagraph"/>
+        <w:numPr>
+          <w:ilvl w:val="1"/>
+          <w:numId w:val="5"/>
+        </w:numPr>
+        <w:rPr>
+          <w:color w:val="CC0000"/>
+        </w:rPr>
+      </w:pPr>
+      <w:r>
+        <w:rPr>
+          <w:color w:val="CC0000"/>
+        </w:rPr>
+        <w:t xml:space="preserve">Source code </w:t>
+      </w:r>
+    </w:p>
+    <w:p>
+      <w:pPr>
+        <w:pStyle w:val="ListParagraph"/>
+        <w:numPr>
+          <w:ilvl w:val="1"/>
+          <w:numId w:val="5"/>
+        </w:numPr>
+        <w:rPr>
+          <w:color w:val="CC0000"/>
+        </w:rPr>
+      </w:pPr>
+      <w:r>
+        <w:rPr>
+          <w:color w:val="CC0000"/>
+        </w:rPr>
+        <w:t xml:space="preserve">Design assets </w:t>
+      </w:r>
+    </w:p>
+    <w:p>
+      <w:pPr>
+        <w:pStyle w:val="ListParagraph"/>
+        <w:numPr>
+          <w:ilvl w:val="1"/>
+          <w:numId w:val="5"/>
+        </w:numPr>
+        <w:rPr>
+          <w:color w:val="CC0000"/>
+        </w:rPr>
+      </w:pPr>
+      <w:r>
+        <w:rPr>
+          <w:color w:val="CC0000"/>
+        </w:rPr>
+        <w:t xml:space="preserve">Images and media </w:t>
+      </w:r>
+    </w:p>
+    <w:p>
+      <w:pPr>
+        <w:pStyle w:val="ListParagraph"/>
+        <w:numPr>
+          <w:ilvl w:val="1"/>
+          <w:numId w:val="5"/>
+        </w:numPr>
+        <w:rPr>
+          <w:color w:val="CC0000"/>
+        </w:rPr>
+      </w:pPr>
+      <w:r>
+        <w:rPr>
+          <w:color w:val="CC0000"/>
+        </w:rPr>
+        <w:t xml:space="preserve">Documentation </w:t>
+      </w:r>
+    </w:p>
+    <w:p>
+      <w:pPr>
+        <w:pStyle w:val="ListParagraph"/>
+        <w:numPr>
+          <w:ilvl w:val="1"/>
+          <w:numId w:val="5"/>
+        </w:numPr>
+        <w:rPr>
+          <w:color w:val="CC0000"/>
+        </w:rPr>
+      </w:pPr>
+      <w:r>
+        <w:rPr>
+          <w:color w:val="CC0000"/>
+        </w:rPr>
+        <w:t xml:space="preserve">Configuration files </w:t>
+      </w:r>
+    </w:p>
+    <w:p>
+      <w:pPr>
+        <w:pStyle w:val="ListParagraph"/>
+        <w:numPr>
+          <w:ilvl w:val="1"/>
+          <w:numId w:val="5"/>
+        </w:numPr>
+        <w:rPr>
+          <w:color w:val="CC0000"/>
+        </w:rPr>
+      </w:pPr>
+      <w:r>
+        <w:rPr>
+          <w:color w:val="CC0000"/>
+        </w:rPr>
+        <w:t xml:space="preserve">Environment variables (where appropriate) </w:t>
+      </w:r>
+    </w:p>
+    <w:p>
+      <w:pPr>
+        <w:pStyle w:val="ListParagraph"/>
+        <w:numPr>
+          <w:ilvl w:val="1"/>
+          <w:numId w:val="5"/>
+        </w:numPr>
+        <w:rPr>
+          <w:color w:val="CC0000"/>
+        </w:rPr>
+      </w:pPr>
+      <w:r>
+        <w:rPr>
+          <w:color w:val="CC0000"/>
+        </w:rPr>
+        <w:t xml:space="preserve">Any additional resources used during development </w:t>
+      </w:r>
+    </w:p>
+    <w:p>
+      <w:pPr>
+        <w:pStyle w:val="ListParagraph"/>
+        <w:ind w:left="405"/>
+        <w:rPr>
+          <w:b/>
+          <w:bCs/>
+          <w:color w:val="CC0000"/>
+        </w:rPr>
+      </w:pPr>
+      <w:r>
+        <w:rPr>
+          <w:b/>
+          <w:bCs/>
+          <w:color w:val="CC0000"/>
+        </w:rPr>
+        <w:t>Platform &amp; Hosting Documentation</w:t>
+      </w:r>
+    </w:p>
+    <w:p>
+      <w:pPr>
+        <w:pStyle w:val="ListParagraph"/>
+        <w:ind w:left="405"/>
+        <w:rPr>
+          <w:color w:val="CC0000"/>
+        </w:rPr>
+      </w:pPr>
+      <w:r>
+        <w:rPr>
+          <w:color w:val="CC0000"/>
+        </w:rPr>
+        <w:t>Provide a breakdown of the services currently in use, including:</w:t>
+      </w:r>
+    </w:p>
+    <w:p>
+      <w:pPr>
+        <w:pStyle w:val="ListParagraph"/>
+        <w:ind w:left="405"/>
+        <w:rPr>
+          <w:color w:val="CC0000"/>
+        </w:rPr>
+      </w:pPr>
+      <w:r>
+        <w:rPr>
+          <w:b/>
+          <w:bCs/>
+          <w:color w:val="CC0000"/>
+        </w:rPr>
+        <w:t>Netlify</w:t>
+      </w:r>
+    </w:p>
+    <w:p>
+      <w:pPr>
+        <w:pStyle w:val="ListParagraph"/>
+        <w:numPr>
+          <w:ilvl w:val="0"/>
+          <w:numId w:val="6"/>
+        </w:numPr>
+        <w:rPr>
+          <w:color w:val="CC0000"/>
+        </w:rPr>
+      </w:pPr>
+      <w:r>
+        <w:rPr>
+          <w:color w:val="CC0000"/>
+        </w:rPr>
+        <w:t xml:space="preserve">Hosting plan </w:t>
+      </w:r>
+    </w:p>
+    <w:p>
+      <w:pPr>
+        <w:pStyle w:val="ListParagraph"/>
+        <w:numPr>
+          <w:ilvl w:val="0"/>
+          <w:numId w:val="6"/>
+        </w:numPr>
+        <w:rPr>
+          <w:color w:val="CC0000"/>
+        </w:rPr>
+      </w:pPr>
+      <w:r>
+        <w:rPr>
+          <w:color w:val="CC0000"/>
+        </w:rPr>
+        <w:t xml:space="preserve">Monthly pricing </w:t>
+      </w:r>
+    </w:p>
+    <w:p>
+      <w:pPr>
+        <w:pStyle w:val="ListParagraph"/>
+        <w:numPr>
+          <w:ilvl w:val="0"/>
+          <w:numId w:val="6"/>
+        </w:numPr>
+        <w:rPr>
+          <w:color w:val="CC0000"/>
+        </w:rPr>
+      </w:pPr>
+      <w:r>
+        <w:rPr>
+          <w:color w:val="CC0000"/>
+        </w:rPr>
+        <w:t xml:space="preserve">Domain configuration </w:t>
+      </w:r>
+    </w:p>
+    <w:p>
+      <w:pPr>
+        <w:pStyle w:val="ListParagraph"/>
+        <w:numPr>
+          <w:ilvl w:val="0"/>
+          <w:numId w:val="6"/>
+        </w:numPr>
+        <w:rPr>
+          <w:color w:val="CC0000"/>
+        </w:rPr>
+      </w:pPr>
+      <w:r>
+        <w:rPr>
+          <w:color w:val="CC0000"/>
+        </w:rPr>
+        <w:t xml:space="preserve">Build settings </w:t>
+      </w:r>
+    </w:p>
+    <w:p>
+      <w:pPr>
+        <w:pStyle w:val="ListParagraph"/>
+        <w:numPr>
+          <w:ilvl w:val="0"/>
+          <w:numId w:val="6"/>
+        </w:numPr>
+        <w:rPr>
+          <w:color w:val="CC0000"/>
+        </w:rPr>
+      </w:pPr>
+      <w:r>
+        <w:rPr>
+          <w:color w:val="CC0000"/>
+        </w:rPr>
+        <w:t xml:space="preserve">Deploy process </w:t>
+      </w:r>
+    </w:p>
+    <w:p>
+      <w:pPr>
+        <w:pStyle w:val="ListParagraph"/>
+        <w:numPr>
+          <w:ilvl w:val="0"/>
+          <w:numId w:val="6"/>
+        </w:numPr>
+        <w:rPr>
+          <w:color w:val="CC0000"/>
+        </w:rPr>
+      </w:pPr>
+      <w:r>
+        <w:rPr>
+          <w:color w:val="CC0000"/>
+        </w:rPr>
+        <w:t xml:space="preserve">Forms, Functions, or other enabled features </w:t>
+      </w:r>
+    </w:p>
+    <w:p>
+      <w:pPr>
+        <w:pStyle w:val="ListParagraph"/>
+        <w:ind w:left="405"/>
+        <w:rPr>
+          <w:color w:val="CC0000"/>
+        </w:rPr>
+      </w:pPr>
+      <w:r>
+        <w:rPr>
+          <w:b/>
+          <w:bCs/>
+          <w:color w:val="CC0000"/>
+        </w:rPr>
+        <w:t>GitHub</w:t>
+      </w:r>
+    </w:p>
+    <w:p>
+      <w:pPr>
+        <w:pStyle w:val="ListParagraph"/>
+        <w:numPr>
+          <w:ilvl w:val="0"/>
+          <w:numId w:val="7"/>
+        </w:numPr>
+        <w:rPr>
+          <w:color w:val="CC0000"/>
+        </w:rPr>
+      </w:pPr>
+      <w:r>
+        <w:rPr>
+          <w:color w:val="CC0000"/>
+        </w:rPr>
+        <w:t xml:space="preserve">Repository information </w:t>
+      </w:r>
+    </w:p>
+    <w:p>
+      <w:pPr>
+        <w:pStyle w:val="ListParagraph"/>
+        <w:numPr>
+          <w:ilvl w:val="0"/>
+          <w:numId w:val="7"/>
+        </w:numPr>
+        <w:rPr>
+          <w:color w:val="CC0000"/>
+        </w:rPr>
+      </w:pPr>
+      <w:r>
+        <w:rPr>
+          <w:color w:val="CC0000"/>
+        </w:rPr>
+        <w:t xml:space="preserve">Ownership/permissions </w:t>
+      </w:r>
+    </w:p>
+    <w:p>
+      <w:pPr>
+        <w:pStyle w:val="ListParagraph"/>
+        <w:numPr>
+          <w:ilvl w:val="0"/>
+          <w:numId w:val="7"/>
+        </w:numPr>
+        <w:rPr>
+          <w:color w:val="CC0000"/>
+        </w:rPr>
+      </w:pPr>
+      <w:r>
+        <w:rPr>
+          <w:color w:val="CC0000"/>
+        </w:rPr>
+        <w:t xml:space="preserve">Branch structure </w:t>
+      </w:r>
+    </w:p>
+    <w:p>
+      <w:pPr>
+        <w:pStyle w:val="ListParagraph"/>
+        <w:numPr>
+          <w:ilvl w:val="0"/>
+          <w:numId w:val="7"/>
+        </w:numPr>
+        <w:rPr>
+          <w:color w:val="CC0000"/>
+        </w:rPr>
+      </w:pPr>
+      <w:r>
+        <w:rPr>
+          <w:color w:val="CC0000"/>
+        </w:rPr>
+        <w:t xml:space="preserve">Deployment workflow </w:t>
+      </w:r>
+    </w:p>
+    <w:p>
+      <w:pPr>
+        <w:pStyle w:val="ListParagraph"/>
+        <w:numPr>
+          <w:ilvl w:val="0"/>
+          <w:numId w:val="7"/>
+        </w:numPr>
+        <w:rPr>
+          <w:color w:val="CC0000"/>
+        </w:rPr>
+      </w:pPr>
+      <w:r>
+        <w:rPr>
+          <w:color w:val="CC0000"/>
+        </w:rPr>
+        <w:t xml:space="preserve">Pricing (if applicable) </w:t>
+      </w:r>
+    </w:p>
+    <w:p>
+      <w:pPr>
+        <w:pStyle w:val="ListParagraph"/>
+        <w:ind w:left="405"/>
+        <w:rPr>
+          <w:b/>
+          <w:bCs/>
+          <w:color w:val="CC0000"/>
+        </w:rPr>
+      </w:pPr>
+      <w:r>
+        <w:rPr>
+          <w:b/>
+          <w:bCs/>
+          <w:color w:val="CC0000"/>
+        </w:rPr>
+        <w:t>Website Review</w:t>
+      </w:r>
+    </w:p>
+    <w:p>
+      <w:pPr>
+        <w:pStyle w:val="ListParagraph"/>
+        <w:ind w:left="405"/>
+        <w:rPr>
+          <w:color w:val="CC0000"/>
+        </w:rPr>
+      </w:pPr>
+      <w:r>
+        <w:rPr>
+          <w:color w:val="CC0000"/>
+        </w:rPr>
+        <w:t>Conduct a final walkthrough to confirm:</w:t>
+      </w:r>
+    </w:p>
+    <w:p>
+      <w:pPr>
+        <w:pStyle w:val="ListParagraph"/>
+        <w:numPr>
+          <w:ilvl w:val="0"/>
+          <w:numId w:val="8"/>
+        </w:numPr>
+        <w:rPr>
+          <w:color w:val="CC0000"/>
+        </w:rPr>
+      </w:pPr>
+      <w:r>
+        <w:rPr>
+          <w:color w:val="CC0000"/>
+        </w:rPr>
+        <w:t xml:space="preserve">Desktop responsiveness </w:t>
+      </w:r>
+    </w:p>
+    <w:p>
+      <w:pPr>
+        <w:pStyle w:val="ListParagraph"/>
+        <w:numPr>
+          <w:ilvl w:val="0"/>
+          <w:numId w:val="8"/>
+        </w:numPr>
+        <w:rPr>
+          <w:color w:val="CC0000"/>
+        </w:rPr>
+      </w:pPr>
+      <w:r>
+        <w:rPr>
+          <w:color w:val="CC0000"/>
+        </w:rPr>
+        <w:t xml:space="preserve">Mobile responsiveness </w:t>
+      </w:r>
+    </w:p>
+    <w:p>
+      <w:pPr>
+        <w:pStyle w:val="ListParagraph"/>
+        <w:numPr>
+          <w:ilvl w:val="0"/>
+          <w:numId w:val="8"/>
+        </w:numPr>
+        <w:rPr>
+          <w:color w:val="CC0000"/>
+        </w:rPr>
+      </w:pPr>
+      <w:r>
+        <w:rPr>
+          <w:color w:val="CC0000"/>
+        </w:rPr>
+        <w:t xml:space="preserve">Navigation and links </w:t>
+      </w:r>
+    </w:p>
+    <w:p>
+      <w:pPr>
+        <w:pStyle w:val="ListParagraph"/>
+        <w:numPr>
+          <w:ilvl w:val="0"/>
+          <w:numId w:val="8"/>
+        </w:numPr>
+        <w:rPr>
+          <w:color w:val="CC0000"/>
+        </w:rPr>
+      </w:pPr>
+      <w:r>
+        <w:rPr>
+          <w:color w:val="CC0000"/>
+        </w:rPr>
+        <w:t xml:space="preserve">Forms functioning correctly </w:t>
+      </w:r>
+    </w:p>
+    <w:p>
+      <w:pPr>
+        <w:pStyle w:val="ListParagraph"/>
+        <w:numPr>
+          <w:ilvl w:val="0"/>
+          <w:numId w:val="8"/>
+        </w:numPr>
+        <w:rPr>
+          <w:color w:val="CC0000"/>
+        </w:rPr>
+      </w:pPr>
+      <w:r>
+        <w:rPr>
+          <w:color w:val="CC0000"/>
+        </w:rPr>
+        <w:t xml:space="preserve">Images and assets loading </w:t>
+      </w:r>
+    </w:p>
+    <w:p>
+      <w:pPr>
+        <w:pStyle w:val="ListParagraph"/>
+        <w:numPr>
+          <w:ilvl w:val="0"/>
+          <w:numId w:val="8"/>
+        </w:numPr>
+        <w:rPr>
+          <w:color w:val="CC0000"/>
+        </w:rPr>
+      </w:pPr>
+      <w:r>
+        <w:rPr>
+          <w:color w:val="CC0000"/>
+        </w:rPr>
+        <w:t xml:space="preserve">Performance review </w:t>
+      </w:r>
+    </w:p>
+    <w:p>
+      <w:pPr>
+        <w:pStyle w:val="ListParagraph"/>
+        <w:numPr>
+          <w:ilvl w:val="0"/>
+          <w:numId w:val="8"/>
+        </w:numPr>
+        <w:rPr>
+          <w:color w:val="CC0000"/>
+        </w:rPr>
+      </w:pPr>
+      <w:r>
+        <w:rPr>
+          <w:color w:val="CC0000"/>
+        </w:rPr>
+        <w:t xml:space="preserve">SEO metadata </w:t>
+      </w:r>
+    </w:p>
+    <w:p>
+      <w:pPr>
+        <w:pStyle w:val="ListParagraph"/>
+        <w:numPr>
+          <w:ilvl w:val="0"/>
+          <w:numId w:val="8"/>
+        </w:numPr>
+        <w:rPr>
+          <w:color w:val="CC0000"/>
+        </w:rPr>
+      </w:pPr>
+      <w:r>
+        <w:rPr>
+          <w:color w:val="CC0000"/>
+        </w:rPr>
+        <w:t xml:space="preserve">Contact information </w:t>
+      </w:r>
+    </w:p>
+    <w:p>
+      <w:pPr>
+        <w:pStyle w:val="ListParagraph"/>
+        <w:numPr>
+          <w:ilvl w:val="0"/>
+          <w:numId w:val="8"/>
+        </w:numPr>
+        <w:rPr>
+          <w:color w:val="CC0000"/>
+        </w:rPr>
+      </w:pPr>
+      <w:r>
+        <w:rPr>
+          <w:color w:val="CC0000"/>
+        </w:rPr>
+        <w:t xml:space="preserve">Browser compatibility </w:t>
+      </w:r>
+    </w:p>
+    <w:p>
+      <w:pPr>
+        <w:pStyle w:val="ListParagraph"/>
+        <w:ind w:left="405"/>
+        <w:rPr>
+          <w:b/>
+          <w:bCs/>
+          <w:color w:val="CC0000"/>
+        </w:rPr>
+      </w:pPr>
+      <w:r>
+        <w:rPr>
+          <w:b/>
+          <w:bCs/>
+          <w:color w:val="CC0000"/>
+        </w:rPr>
+        <w:t>Netlify Walkthrough</w:t>
+      </w:r>
+    </w:p>
+    <w:p>
+      <w:pPr>
+        <w:pStyle w:val="ListParagraph"/>
+        <w:ind w:left="405"/>
+        <w:rPr>
+          <w:color w:val="CC0000"/>
+        </w:rPr>
+      </w:pPr>
+      <w:r>
+        <w:rPr>
+          <w:color w:val="CC0000"/>
+        </w:rPr>
+        <w:t>Review the following with the new owner:</w:t>
+      </w:r>
+    </w:p>
+    <w:p>
+      <w:pPr>
+        <w:pStyle w:val="ListParagraph"/>
+        <w:numPr>
+          <w:ilvl w:val="0"/>
+          <w:numId w:val="9"/>
+        </w:numPr>
+        <w:rPr>
+          <w:color w:val="CC0000"/>
+        </w:rPr>
+      </w:pPr>
+      <w:r>
+        <w:rPr>
+          <w:color w:val="CC0000"/>
+        </w:rPr>
+        <w:t xml:space="preserve">How deployments work </w:t>
+      </w:r>
+    </w:p>
+    <w:p>
+      <w:pPr>
+        <w:pStyle w:val="ListParagraph"/>
+        <w:numPr>
+          <w:ilvl w:val="0"/>
+          <w:numId w:val="9"/>
+        </w:numPr>
+        <w:rPr>
+          <w:color w:val="CC0000"/>
+        </w:rPr>
+      </w:pPr>
+      <w:r>
+        <w:rPr>
+          <w:color w:val="CC0000"/>
+        </w:rPr>
+        <w:t xml:space="preserve">Deploy previews </w:t>
+      </w:r>
+    </w:p>
+    <w:p>
+      <w:pPr>
+        <w:pStyle w:val="ListParagraph"/>
+        <w:numPr>
+          <w:ilvl w:val="0"/>
+          <w:numId w:val="9"/>
+        </w:numPr>
+        <w:rPr>
+          <w:color w:val="CC0000"/>
+        </w:rPr>
+      </w:pPr>
+      <w:r>
+        <w:rPr>
+          <w:color w:val="CC0000"/>
+        </w:rPr>
+        <w:t xml:space="preserve">Publishing new changes </w:t>
+      </w:r>
+    </w:p>
+    <w:p>
+      <w:pPr>
+        <w:pStyle w:val="ListParagraph"/>
+        <w:numPr>
+          <w:ilvl w:val="0"/>
+          <w:numId w:val="9"/>
+        </w:numPr>
+        <w:rPr>
+          <w:color w:val="CC0000"/>
+        </w:rPr>
+      </w:pPr>
+      <w:r>
+        <w:rPr>
+          <w:color w:val="CC0000"/>
+        </w:rPr>
+        <w:t xml:space="preserve">Environment variables </w:t>
+      </w:r>
+    </w:p>
+    <w:p>
+      <w:pPr>
+        <w:pStyle w:val="ListParagraph"/>
+        <w:numPr>
+          <w:ilvl w:val="0"/>
+          <w:numId w:val="9"/>
+        </w:numPr>
+        <w:rPr>
+          <w:color w:val="CC0000"/>
+        </w:rPr>
+      </w:pPr>
+      <w:r>
+        <w:rPr>
+          <w:color w:val="CC0000"/>
+        </w:rPr>
+        <w:t xml:space="preserve">Custom domain management </w:t>
+      </w:r>
+    </w:p>
+    <w:p>
+      <w:pPr>
+        <w:pStyle w:val="ListParagraph"/>
+        <w:numPr>
+          <w:ilvl w:val="0"/>
+          <w:numId w:val="9"/>
+        </w:numPr>
+        <w:rPr>
+          <w:color w:val="CC0000"/>
+        </w:rPr>
+      </w:pPr>
+      <w:r>
+        <w:rPr>
+          <w:color w:val="CC0000"/>
+        </w:rPr>
+        <w:t xml:space="preserve">SSL certificate </w:t>
+      </w:r>
+    </w:p>
+    <w:p>
+      <w:pPr>
+        <w:pStyle w:val="ListParagraph"/>
+        <w:numPr>
+          <w:ilvl w:val="0"/>
+          <w:numId w:val="9"/>
+        </w:numPr>
+        <w:rPr>
+          <w:color w:val="CC0000"/>
+        </w:rPr>
+      </w:pPr>
+      <w:r>
+        <w:rPr>
+          <w:color w:val="CC0000"/>
+        </w:rPr>
+        <w:lastRenderedPageBreak/>
+        <w:t xml:space="preserve">Billing and payment settings </w:t>
+      </w:r>
+    </w:p>
+    <w:p>
+      <w:pPr>
+        <w:pStyle w:val="ListParagraph"/>
+        <w:numPr>
+          <w:ilvl w:val="0"/>
+          <w:numId w:val="9"/>
+        </w:numPr>
+        <w:rPr>
+          <w:color w:val="CC0000"/>
+        </w:rPr>
+      </w:pPr>
+      <w:r>
+        <w:rPr>
+          <w:color w:val="CC0000"/>
+        </w:rPr>
+        <w:t xml:space="preserve">Team member access </w:t>
+      </w:r>
+    </w:p>
+    <w:p>
+      <w:pPr>
+        <w:pStyle w:val="ListParagraph"/>
+        <w:numPr>
+          <w:ilvl w:val="0"/>
+          <w:numId w:val="9"/>
+        </w:numPr>
+        <w:rPr>
+          <w:color w:val="CC0000"/>
+        </w:rPr>
+      </w:pPr>
+      <w:r>
+        <w:rPr>
+          <w:color w:val="CC0000"/>
+        </w:rPr>
+        <w:t xml:space="preserve">Rollback/version history </w:t>
+      </w:r>
+    </w:p>
+    <w:p>
+      <w:pPr>
+        <w:pStyle w:val="ListParagraph"/>
+        <w:ind w:left="405"/>
+        <w:rPr>
+          <w:b/>
+          <w:bCs/>
+          <w:color w:val="CC0000"/>
+        </w:rPr>
+      </w:pPr>
+      <w:r>
+        <w:rPr>
+          <w:b/>
+          <w:bCs/>
+          <w:color w:val="CC0000"/>
+        </w:rPr>
+        <w:t>Final Handoff</w:t>
+      </w:r>
+    </w:p>
+    <w:p>
+      <w:pPr>
+        <w:pStyle w:val="ListParagraph"/>
+        <w:numPr>
+          <w:ilvl w:val="0"/>
+          <w:numId w:val="10"/>
+        </w:numPr>
+        <w:rPr>
+          <w:color w:val="CC0000"/>
+        </w:rPr>
+      </w:pPr>
+      <w:r>
+        <w:rPr>
+          <w:color w:val="CC0000"/>
+        </w:rPr>
+        <w:t xml:space="preserve">Confirm all credentials have been transferred. </w:t>
+      </w:r>
+    </w:p>
+    <w:p>
+      <w:pPr>
+        <w:pStyle w:val="ListParagraph"/>
+        <w:numPr>
+          <w:ilvl w:val="0"/>
+          <w:numId w:val="10"/>
+        </w:numPr>
+        <w:rPr>
+          <w:color w:val="CC0000"/>
+        </w:rPr>
+      </w:pPr>
+      <w:r>
+        <w:rPr>
+          <w:color w:val="CC0000"/>
+        </w:rPr>
+        <w:t xml:space="preserve">Verify the website is live and functioning properly. </w:t>
+      </w:r>
+    </w:p>
+    <w:p>
+      <w:pPr>
+        <w:pStyle w:val="ListParagraph"/>
+        <w:numPr>
+          <w:ilvl w:val="0"/>
+          <w:numId w:val="10"/>
+        </w:numPr>
+        <w:rPr>
+          <w:color w:val="CC0000"/>
+        </w:rPr>
+      </w:pPr>
+      <w:r>
+        <w:rPr>
+          <w:color w:val="CC0000"/>
+        </w:rPr>
+        <w:t xml:space="preserve">Deliver all documentation and project files. </w:t>
+      </w:r>
+    </w:p>
+    <w:p>
+      <w:pPr>
+        <w:pStyle w:val="ListParagraph"/>
+        <w:numPr>
+          <w:ilvl w:val="0"/>
+          <w:numId w:val="10"/>
+        </w:numPr>
+        <w:rPr>
+          <w:color w:val="CC0000"/>
+        </w:rPr>
+      </w:pPr>
+      <w:r>
+        <w:rPr>
+          <w:color w:val="CC0000"/>
+        </w:rPr>
+        <w:t>Answer any final questions and confirm successful handoff.</w:t>
+      </w:r>
+    </w:p>
+    <w:p>
+      <w:pPr>
+        <w:pStyle w:val="ListParagraph"/>
+        <w:ind w:left="405"/>
         <w:rPr>
           <w:color w:val="CC0000"/>
         </w:rPr>
@@ -683,6 +1813,1049 @@
     </w:lvl>
   </w:abstractNum>
   <w:abstractNum w:abstractNumId="1" w15:restartNumberingAfterBreak="0">
+    <w:nsid w:val="146A5200"/>
+    <w:multiLevelType w:val="multilevel"/>
+    <w:tmpl w:val="273EE93E"/>
+    <w:lvl w:ilvl="0">
+      <w:start w:val="1"/>
+      <w:numFmt w:val="bullet"/>
+      <w:lvlText w:val=""/>
+      <w:lvlJc w:val="left"/>
+      <w:pPr>
+        <w:tabs>
+          <w:tab w:val="num" w:pos="720"/>
+        </w:tabs>
+        <w:ind w:left="720" w:hanging="360"/>
+      </w:pPr>
+      <w:rPr>
+        <w:rFonts w:ascii="Symbol" w:hAnsi="Symbol" w:hint="default"/>
+        <w:sz w:val="20"/>
+      </w:rPr>
+    </w:lvl>
+    <w:lvl w:ilvl="1" w:tentative="1">
+      <w:start w:val="1"/>
+      <w:numFmt w:val="bullet"/>
+      <w:lvlText w:val="o"/>
+      <w:lvlJc w:val="left"/>
+      <w:pPr>
+        <w:tabs>
+          <w:tab w:val="num" w:pos="1440"/>
+        </w:tabs>
+        <w:ind w:left="1440" w:hanging="360"/>
+      </w:pPr>
+      <w:rPr>
+        <w:rFonts w:ascii="Courier New" w:hAnsi="Courier New" w:hint="default"/>
+        <w:sz w:val="20"/>
+      </w:rPr>
+    </w:lvl>
+    <w:lvl w:ilvl="2" w:tentative="1">
+      <w:start w:val="1"/>
+      <w:numFmt w:val="bullet"/>
+      <w:lvlText w:val=""/>
+      <w:lvlJc w:val="left"/>
+      <w:pPr>
+        <w:tabs>
+          <w:tab w:val="num" w:pos="2160"/>
+        </w:tabs>
+        <w:ind w:left="2160" w:hanging="360"/>
+      </w:pPr>
+      <w:rPr>
+        <w:rFonts w:ascii="Wingdings" w:hAnsi="Wingdings" w:hint="default"/>
+        <w:sz w:val="20"/>
+      </w:rPr>
+    </w:lvl>
+    <w:lvl w:ilvl="3" w:tentative="1">
+      <w:start w:val="1"/>
+      <w:numFmt w:val="bullet"/>
+      <w:lvlText w:val=""/>
+      <w:lvlJc w:val="left"/>
+      <w:pPr>
+        <w:tabs>
+          <w:tab w:val="num" w:pos="2880"/>
+        </w:tabs>
+        <w:ind w:left="2880" w:hanging="360"/>
+      </w:pPr>
+      <w:rPr>
+        <w:rFonts w:ascii="Wingdings" w:hAnsi="Wingdings" w:hint="default"/>
+        <w:sz w:val="20"/>
+      </w:rPr>
+    </w:lvl>
+    <w:lvl w:ilvl="4" w:tentative="1">
+      <w:start w:val="1"/>
+      <w:numFmt w:val="bullet"/>
+      <w:lvlText w:val=""/>
+      <w:lvlJc w:val="left"/>
+      <w:pPr>
+        <w:tabs>
+          <w:tab w:val="num" w:pos="3600"/>
+        </w:tabs>
+        <w:ind w:left="3600" w:hanging="360"/>
+      </w:pPr>
+      <w:rPr>
+        <w:rFonts w:ascii="Wingdings" w:hAnsi="Wingdings" w:hint="default"/>
+        <w:sz w:val="20"/>
+      </w:rPr>
+    </w:lvl>
+    <w:lvl w:ilvl="5" w:tentative="1">
+      <w:start w:val="1"/>
+      <w:numFmt w:val="bullet"/>
+      <w:lvlText w:val=""/>
+      <w:lvlJc w:val="left"/>
+      <w:pPr>
+        <w:tabs>
+          <w:tab w:val="num" w:pos="4320"/>
+        </w:tabs>
+        <w:ind w:left="4320" w:hanging="360"/>
+      </w:pPr>
+      <w:rPr>
+        <w:rFonts w:ascii="Wingdings" w:hAnsi="Wingdings" w:hint="default"/>
+        <w:sz w:val="20"/>
+      </w:rPr>
+    </w:lvl>
+    <w:lvl w:ilvl="6" w:tentative="1">
+      <w:start w:val="1"/>
+      <w:numFmt w:val="bullet"/>
+      <w:lvlText w:val=""/>
+      <w:lvlJc w:val="left"/>
+      <w:pPr>
+        <w:tabs>
+          <w:tab w:val="num" w:pos="5040"/>
+        </w:tabs>
+        <w:ind w:left="5040" w:hanging="360"/>
+      </w:pPr>
+      <w:rPr>
+        <w:rFonts w:ascii="Wingdings" w:hAnsi="Wingdings" w:hint="default"/>
+        <w:sz w:val="20"/>
+      </w:rPr>
+    </w:lvl>
+    <w:lvl w:ilvl="7" w:tentative="1">
+      <w:start w:val="1"/>
+      <w:numFmt w:val="bullet"/>
+      <w:lvlText w:val=""/>
+      <w:lvlJc w:val="left"/>
+      <w:pPr>
+        <w:tabs>
+          <w:tab w:val="num" w:pos="5760"/>
+        </w:tabs>
+        <w:ind w:left="5760" w:hanging="360"/>
+      </w:pPr>
+      <w:rPr>
+        <w:rFonts w:ascii="Wingdings" w:hAnsi="Wingdings" w:hint="default"/>
+        <w:sz w:val="20"/>
+      </w:rPr>
+    </w:lvl>
+    <w:lvl w:ilvl="8" w:tentative="1">
+      <w:start w:val="1"/>
+      <w:numFmt w:val="bullet"/>
+      <w:lvlText w:val=""/>
+      <w:lvlJc w:val="left"/>
+      <w:pPr>
+        <w:tabs>
+          <w:tab w:val="num" w:pos="6480"/>
+        </w:tabs>
+        <w:ind w:left="6480" w:hanging="360"/>
+      </w:pPr>
+      <w:rPr>
+        <w:rFonts w:ascii="Wingdings" w:hAnsi="Wingdings" w:hint="default"/>
+        <w:sz w:val="20"/>
+      </w:rPr>
+    </w:lvl>
+  </w:abstractNum>
+  <w:abstractNum w:abstractNumId="2" w15:restartNumberingAfterBreak="0">
+    <w:nsid w:val="1BCA52BD"/>
+    <w:multiLevelType w:val="multilevel"/>
+    <w:tmpl w:val="EA008964"/>
+    <w:lvl w:ilvl="0">
+      <w:start w:val="1"/>
+      <w:numFmt w:val="bullet"/>
+      <w:lvlText w:val=""/>
+      <w:lvlJc w:val="left"/>
+      <w:pPr>
+        <w:tabs>
+          <w:tab w:val="num" w:pos="720"/>
+        </w:tabs>
+        <w:ind w:left="720" w:hanging="360"/>
+      </w:pPr>
+      <w:rPr>
+        <w:rFonts w:ascii="Symbol" w:hAnsi="Symbol" w:hint="default"/>
+        <w:sz w:val="20"/>
+      </w:rPr>
+    </w:lvl>
+    <w:lvl w:ilvl="1" w:tentative="1">
+      <w:start w:val="1"/>
+      <w:numFmt w:val="bullet"/>
+      <w:lvlText w:val="o"/>
+      <w:lvlJc w:val="left"/>
+      <w:pPr>
+        <w:tabs>
+          <w:tab w:val="num" w:pos="1440"/>
+        </w:tabs>
+        <w:ind w:left="1440" w:hanging="360"/>
+      </w:pPr>
+      <w:rPr>
+        <w:rFonts w:ascii="Courier New" w:hAnsi="Courier New" w:hint="default"/>
+        <w:sz w:val="20"/>
+      </w:rPr>
+    </w:lvl>
+    <w:lvl w:ilvl="2" w:tentative="1">
+      <w:start w:val="1"/>
+      <w:numFmt w:val="bullet"/>
+      <w:lvlText w:val=""/>
+      <w:lvlJc w:val="left"/>
+      <w:pPr>
+        <w:tabs>
+          <w:tab w:val="num" w:pos="2160"/>
+        </w:tabs>
+        <w:ind w:left="2160" w:hanging="360"/>
+      </w:pPr>
+      <w:rPr>
+        <w:rFonts w:ascii="Wingdings" w:hAnsi="Wingdings" w:hint="default"/>
+        <w:sz w:val="20"/>
+      </w:rPr>
+    </w:lvl>
+    <w:lvl w:ilvl="3" w:tentative="1">
+      <w:start w:val="1"/>
+      <w:numFmt w:val="bullet"/>
+      <w:lvlText w:val=""/>
+      <w:lvlJc w:val="left"/>
+      <w:pPr>
+        <w:tabs>
+          <w:tab w:val="num" w:pos="2880"/>
+        </w:tabs>
+        <w:ind w:left="2880" w:hanging="360"/>
+      </w:pPr>
+      <w:rPr>
+        <w:rFonts w:ascii="Wingdings" w:hAnsi="Wingdings" w:hint="default"/>
+        <w:sz w:val="20"/>
+      </w:rPr>
+    </w:lvl>
+    <w:lvl w:ilvl="4" w:tentative="1">
+      <w:start w:val="1"/>
+      <w:numFmt w:val="bullet"/>
+      <w:lvlText w:val=""/>
+      <w:lvlJc w:val="left"/>
+      <w:pPr>
+        <w:tabs>
+          <w:tab w:val="num" w:pos="3600"/>
+        </w:tabs>
+        <w:ind w:left="3600" w:hanging="360"/>
+      </w:pPr>
+      <w:rPr>
+        <w:rFonts w:ascii="Wingdings" w:hAnsi="Wingdings" w:hint="default"/>
+        <w:sz w:val="20"/>
+      </w:rPr>
+    </w:lvl>
+    <w:lvl w:ilvl="5" w:tentative="1">
+      <w:start w:val="1"/>
+      <w:numFmt w:val="bullet"/>
+      <w:lvlText w:val=""/>
+      <w:lvlJc w:val="left"/>
+      <w:pPr>
+        <w:tabs>
+          <w:tab w:val="num" w:pos="4320"/>
+        </w:tabs>
+        <w:ind w:left="4320" w:hanging="360"/>
+      </w:pPr>
+      <w:rPr>
+        <w:rFonts w:ascii="Wingdings" w:hAnsi="Wingdings" w:hint="default"/>
+        <w:sz w:val="20"/>
+      </w:rPr>
+    </w:lvl>
+    <w:lvl w:ilvl="6" w:tentative="1">
+      <w:start w:val="1"/>
+      <w:numFmt w:val="bullet"/>
+      <w:lvlText w:val=""/>
+      <w:lvlJc w:val="left"/>
+      <w:pPr>
+        <w:tabs>
+          <w:tab w:val="num" w:pos="5040"/>
+        </w:tabs>
+        <w:ind w:left="5040" w:hanging="360"/>
+      </w:pPr>
+      <w:rPr>
+        <w:rFonts w:ascii="Wingdings" w:hAnsi="Wingdings" w:hint="default"/>
+        <w:sz w:val="20"/>
+      </w:rPr>
+    </w:lvl>
+    <w:lvl w:ilvl="7" w:tentative="1">
+      <w:start w:val="1"/>
+      <w:numFmt w:val="bullet"/>
+      <w:lvlText w:val=""/>
+      <w:lvlJc w:val="left"/>
+      <w:pPr>
+        <w:tabs>
+          <w:tab w:val="num" w:pos="5760"/>
+        </w:tabs>
+        <w:ind w:left="5760" w:hanging="360"/>
+      </w:pPr>
+      <w:rPr>
+        <w:rFonts w:ascii="Wingdings" w:hAnsi="Wingdings" w:hint="default"/>
+        <w:sz w:val="20"/>
+      </w:rPr>
+    </w:lvl>
+    <w:lvl w:ilvl="8" w:tentative="1">
+      <w:start w:val="1"/>
+      <w:numFmt w:val="bullet"/>
+      <w:lvlText w:val=""/>
+      <w:lvlJc w:val="left"/>
+      <w:pPr>
+        <w:tabs>
+          <w:tab w:val="num" w:pos="6480"/>
+        </w:tabs>
+        <w:ind w:left="6480" w:hanging="360"/>
+      </w:pPr>
+      <w:rPr>
+        <w:rFonts w:ascii="Wingdings" w:hAnsi="Wingdings" w:hint="default"/>
+        <w:sz w:val="20"/>
+      </w:rPr>
+    </w:lvl>
+  </w:abstractNum>
+  <w:abstractNum w:abstractNumId="3" w15:restartNumberingAfterBreak="0">
+    <w:nsid w:val="23EF50BA"/>
+    <w:multiLevelType w:val="multilevel"/>
+    <w:tmpl w:val="6F3CEEDE"/>
+    <w:lvl w:ilvl="0">
+      <w:start w:val="1"/>
+      <w:numFmt w:val="bullet"/>
+      <w:lvlText w:val=""/>
+      <w:lvlJc w:val="left"/>
+      <w:pPr>
+        <w:tabs>
+          <w:tab w:val="num" w:pos="720"/>
+        </w:tabs>
+        <w:ind w:left="720" w:hanging="360"/>
+      </w:pPr>
+      <w:rPr>
+        <w:rFonts w:ascii="Symbol" w:hAnsi="Symbol" w:hint="default"/>
+        <w:sz w:val="20"/>
+      </w:rPr>
+    </w:lvl>
+    <w:lvl w:ilvl="1">
+      <w:start w:val="1"/>
+      <w:numFmt w:val="bullet"/>
+      <w:lvlText w:val="o"/>
+      <w:lvlJc w:val="left"/>
+      <w:pPr>
+        <w:tabs>
+          <w:tab w:val="num" w:pos="1440"/>
+        </w:tabs>
+        <w:ind w:left="1440" w:hanging="360"/>
+      </w:pPr>
+      <w:rPr>
+        <w:rFonts w:ascii="Courier New" w:hAnsi="Courier New" w:hint="default"/>
+        <w:sz w:val="20"/>
+      </w:rPr>
+    </w:lvl>
+    <w:lvl w:ilvl="2" w:tentative="1">
+      <w:start w:val="1"/>
+      <w:numFmt w:val="bullet"/>
+      <w:lvlText w:val=""/>
+      <w:lvlJc w:val="left"/>
+      <w:pPr>
+        <w:tabs>
+          <w:tab w:val="num" w:pos="2160"/>
+        </w:tabs>
+        <w:ind w:left="2160" w:hanging="360"/>
+      </w:pPr>
+      <w:rPr>
+        <w:rFonts w:ascii="Wingdings" w:hAnsi="Wingdings" w:hint="default"/>
+        <w:sz w:val="20"/>
+      </w:rPr>
+    </w:lvl>
+    <w:lvl w:ilvl="3" w:tentative="1">
+      <w:start w:val="1"/>
+      <w:numFmt w:val="bullet"/>
+      <w:lvlText w:val=""/>
+      <w:lvlJc w:val="left"/>
+      <w:pPr>
+        <w:tabs>
+          <w:tab w:val="num" w:pos="2880"/>
+        </w:tabs>
+        <w:ind w:left="2880" w:hanging="360"/>
+      </w:pPr>
+      <w:rPr>
+        <w:rFonts w:ascii="Wingdings" w:hAnsi="Wingdings" w:hint="default"/>
+        <w:sz w:val="20"/>
+      </w:rPr>
+    </w:lvl>
+    <w:lvl w:ilvl="4" w:tentative="1">
+      <w:start w:val="1"/>
+      <w:numFmt w:val="bullet"/>
+      <w:lvlText w:val=""/>
+      <w:lvlJc w:val="left"/>
+      <w:pPr>
+        <w:tabs>
+          <w:tab w:val="num" w:pos="3600"/>
+        </w:tabs>
+        <w:ind w:left="3600" w:hanging="360"/>
+      </w:pPr>
+      <w:rPr>
+        <w:rFonts w:ascii="Wingdings" w:hAnsi="Wingdings" w:hint="default"/>
+        <w:sz w:val="20"/>
+      </w:rPr>
+    </w:lvl>
+    <w:lvl w:ilvl="5" w:tentative="1">
+      <w:start w:val="1"/>
+      <w:numFmt w:val="bullet"/>
+      <w:lvlText w:val=""/>
+      <w:lvlJc w:val="left"/>
+      <w:pPr>
+        <w:tabs>
+          <w:tab w:val="num" w:pos="4320"/>
+        </w:tabs>
+        <w:ind w:left="4320" w:hanging="360"/>
+      </w:pPr>
+      <w:rPr>
+        <w:rFonts w:ascii="Wingdings" w:hAnsi="Wingdings" w:hint="default"/>
+        <w:sz w:val="20"/>
+      </w:rPr>
+    </w:lvl>
+    <w:lvl w:ilvl="6" w:tentative="1">
+      <w:start w:val="1"/>
+      <w:numFmt w:val="bullet"/>
+      <w:lvlText w:val=""/>
+      <w:lvlJc w:val="left"/>
+      <w:pPr>
+        <w:tabs>
+          <w:tab w:val="num" w:pos="5040"/>
+        </w:tabs>
+        <w:ind w:left="5040" w:hanging="360"/>
+      </w:pPr>
+      <w:rPr>
+        <w:rFonts w:ascii="Wingdings" w:hAnsi="Wingdings" w:hint="default"/>
+        <w:sz w:val="20"/>
+      </w:rPr>
+    </w:lvl>
+    <w:lvl w:ilvl="7" w:tentative="1">
+      <w:start w:val="1"/>
+      <w:numFmt w:val="bullet"/>
+      <w:lvlText w:val=""/>
+      <w:lvlJc w:val="left"/>
+      <w:pPr>
+        <w:tabs>
+          <w:tab w:val="num" w:pos="5760"/>
+        </w:tabs>
+        <w:ind w:left="5760" w:hanging="360"/>
+      </w:pPr>
+      <w:rPr>
+        <w:rFonts w:ascii="Wingdings" w:hAnsi="Wingdings" w:hint="default"/>
+        <w:sz w:val="20"/>
+      </w:rPr>
+    </w:lvl>
+    <w:lvl w:ilvl="8" w:tentative="1">
+      <w:start w:val="1"/>
+      <w:numFmt w:val="bullet"/>
+      <w:lvlText w:val=""/>
+      <w:lvlJc w:val="left"/>
+      <w:pPr>
+        <w:tabs>
+          <w:tab w:val="num" w:pos="6480"/>
+        </w:tabs>
+        <w:ind w:left="6480" w:hanging="360"/>
+      </w:pPr>
+      <w:rPr>
+        <w:rFonts w:ascii="Wingdings" w:hAnsi="Wingdings" w:hint="default"/>
+        <w:sz w:val="20"/>
+      </w:rPr>
+    </w:lvl>
+  </w:abstractNum>
+  <w:abstractNum w:abstractNumId="4" w15:restartNumberingAfterBreak="0">
+    <w:nsid w:val="32175C6C"/>
+    <w:multiLevelType w:val="multilevel"/>
+    <w:tmpl w:val="CB1A23C8"/>
+    <w:lvl w:ilvl="0">
+      <w:start w:val="1"/>
+      <w:numFmt w:val="bullet"/>
+      <w:lvlText w:val=""/>
+      <w:lvlJc w:val="left"/>
+      <w:pPr>
+        <w:tabs>
+          <w:tab w:val="num" w:pos="720"/>
+        </w:tabs>
+        <w:ind w:left="720" w:hanging="360"/>
+      </w:pPr>
+      <w:rPr>
+        <w:rFonts w:ascii="Symbol" w:hAnsi="Symbol" w:hint="default"/>
+        <w:sz w:val="20"/>
+      </w:rPr>
+    </w:lvl>
+    <w:lvl w:ilvl="1" w:tentative="1">
+      <w:start w:val="1"/>
+      <w:numFmt w:val="bullet"/>
+      <w:lvlText w:val="o"/>
+      <w:lvlJc w:val="left"/>
+      <w:pPr>
+        <w:tabs>
+          <w:tab w:val="num" w:pos="1440"/>
+        </w:tabs>
+        <w:ind w:left="1440" w:hanging="360"/>
+      </w:pPr>
+      <w:rPr>
+        <w:rFonts w:ascii="Courier New" w:hAnsi="Courier New" w:hint="default"/>
+        <w:sz w:val="20"/>
+      </w:rPr>
+    </w:lvl>
+    <w:lvl w:ilvl="2" w:tentative="1">
+      <w:start w:val="1"/>
+      <w:numFmt w:val="bullet"/>
+      <w:lvlText w:val=""/>
+      <w:lvlJc w:val="left"/>
+      <w:pPr>
+        <w:tabs>
+          <w:tab w:val="num" w:pos="2160"/>
+        </w:tabs>
+        <w:ind w:left="2160" w:hanging="360"/>
+      </w:pPr>
+      <w:rPr>
+        <w:rFonts w:ascii="Wingdings" w:hAnsi="Wingdings" w:hint="default"/>
+        <w:sz w:val="20"/>
+      </w:rPr>
+    </w:lvl>
+    <w:lvl w:ilvl="3" w:tentative="1">
+      <w:start w:val="1"/>
+      <w:numFmt w:val="bullet"/>
+      <w:lvlText w:val=""/>
+      <w:lvlJc w:val="left"/>
+      <w:pPr>
+        <w:tabs>
+          <w:tab w:val="num" w:pos="2880"/>
+        </w:tabs>
+        <w:ind w:left="2880" w:hanging="360"/>
+      </w:pPr>
+      <w:rPr>
+        <w:rFonts w:ascii="Wingdings" w:hAnsi="Wingdings" w:hint="default"/>
+        <w:sz w:val="20"/>
+      </w:rPr>
+    </w:lvl>
+    <w:lvl w:ilvl="4" w:tentative="1">
+      <w:start w:val="1"/>
+      <w:numFmt w:val="bullet"/>
+      <w:lvlText w:val=""/>
+      <w:lvlJc w:val="left"/>
+      <w:pPr>
+        <w:tabs>
+          <w:tab w:val="num" w:pos="3600"/>
+        </w:tabs>
+        <w:ind w:left="3600" w:hanging="360"/>
+      </w:pPr>
+      <w:rPr>
+        <w:rFonts w:ascii="Wingdings" w:hAnsi="Wingdings" w:hint="default"/>
+        <w:sz w:val="20"/>
+      </w:rPr>
+    </w:lvl>
+    <w:lvl w:ilvl="5" w:tentative="1">
+      <w:start w:val="1"/>
+      <w:numFmt w:val="bullet"/>
+      <w:lvlText w:val=""/>
+      <w:lvlJc w:val="left"/>
+      <w:pPr>
+        <w:tabs>
+          <w:tab w:val="num" w:pos="4320"/>
+        </w:tabs>
+        <w:ind w:left="4320" w:hanging="360"/>
+      </w:pPr>
+      <w:rPr>
+        <w:rFonts w:ascii="Wingdings" w:hAnsi="Wingdings" w:hint="default"/>
+        <w:sz w:val="20"/>
+      </w:rPr>
+    </w:lvl>
+    <w:lvl w:ilvl="6" w:tentative="1">
+      <w:start w:val="1"/>
+      <w:numFmt w:val="bullet"/>
+      <w:lvlText w:val=""/>
+      <w:lvlJc w:val="left"/>
+      <w:pPr>
+        <w:tabs>
+          <w:tab w:val="num" w:pos="5040"/>
+        </w:tabs>
+        <w:ind w:left="5040" w:hanging="360"/>
+      </w:pPr>
+      <w:rPr>
+        <w:rFonts w:ascii="Wingdings" w:hAnsi="Wingdings" w:hint="default"/>
+        <w:sz w:val="20"/>
+      </w:rPr>
+    </w:lvl>
+    <w:lvl w:ilvl="7" w:tentative="1">
+      <w:start w:val="1"/>
+      <w:numFmt w:val="bullet"/>
+      <w:lvlText w:val=""/>
+      <w:lvlJc w:val="left"/>
+      <w:pPr>
+        <w:tabs>
+          <w:tab w:val="num" w:pos="5760"/>
+        </w:tabs>
+        <w:ind w:left="5760" w:hanging="360"/>
+      </w:pPr>
+      <w:rPr>
+        <w:rFonts w:ascii="Wingdings" w:hAnsi="Wingdings" w:hint="default"/>
+        <w:sz w:val="20"/>
+      </w:rPr>
+    </w:lvl>
+    <w:lvl w:ilvl="8" w:tentative="1">
+      <w:start w:val="1"/>
+      <w:numFmt w:val="bullet"/>
+      <w:lvlText w:val=""/>
+      <w:lvlJc w:val="left"/>
+      <w:pPr>
+        <w:tabs>
+          <w:tab w:val="num" w:pos="6480"/>
+        </w:tabs>
+        <w:ind w:left="6480" w:hanging="360"/>
+      </w:pPr>
+      <w:rPr>
+        <w:rFonts w:ascii="Wingdings" w:hAnsi="Wingdings" w:hint="default"/>
+        <w:sz w:val="20"/>
+      </w:rPr>
+    </w:lvl>
+  </w:abstractNum>
+  <w:abstractNum w:abstractNumId="5" w15:restartNumberingAfterBreak="0">
+    <w:nsid w:val="36AC3467"/>
+    <w:multiLevelType w:val="multilevel"/>
+    <w:tmpl w:val="336296B6"/>
+    <w:lvl w:ilvl="0">
+      <w:start w:val="1"/>
+      <w:numFmt w:val="bullet"/>
+      <w:lvlText w:val=""/>
+      <w:lvlJc w:val="left"/>
+      <w:pPr>
+        <w:tabs>
+          <w:tab w:val="num" w:pos="720"/>
+        </w:tabs>
+        <w:ind w:left="720" w:hanging="360"/>
+      </w:pPr>
+      <w:rPr>
+        <w:rFonts w:ascii="Symbol" w:hAnsi="Symbol" w:hint="default"/>
+        <w:sz w:val="20"/>
+      </w:rPr>
+    </w:lvl>
+    <w:lvl w:ilvl="1" w:tentative="1">
+      <w:start w:val="1"/>
+      <w:numFmt w:val="bullet"/>
+      <w:lvlText w:val="o"/>
+      <w:lvlJc w:val="left"/>
+      <w:pPr>
+        <w:tabs>
+          <w:tab w:val="num" w:pos="1440"/>
+        </w:tabs>
+        <w:ind w:left="1440" w:hanging="360"/>
+      </w:pPr>
+      <w:rPr>
+        <w:rFonts w:ascii="Courier New" w:hAnsi="Courier New" w:hint="default"/>
+        <w:sz w:val="20"/>
+      </w:rPr>
+    </w:lvl>
+    <w:lvl w:ilvl="2" w:tentative="1">
+      <w:start w:val="1"/>
+      <w:numFmt w:val="bullet"/>
+      <w:lvlText w:val=""/>
+      <w:lvlJc w:val="left"/>
+      <w:pPr>
+        <w:tabs>
+          <w:tab w:val="num" w:pos="2160"/>
+        </w:tabs>
+        <w:ind w:left="2160" w:hanging="360"/>
+      </w:pPr>
+      <w:rPr>
+        <w:rFonts w:ascii="Wingdings" w:hAnsi="Wingdings" w:hint="default"/>
+        <w:sz w:val="20"/>
+      </w:rPr>
+    </w:lvl>
+    <w:lvl w:ilvl="3" w:tentative="1">
+      <w:start w:val="1"/>
+      <w:numFmt w:val="bullet"/>
+      <w:lvlText w:val=""/>
+      <w:lvlJc w:val="left"/>
+      <w:pPr>
+        <w:tabs>
+          <w:tab w:val="num" w:pos="2880"/>
+        </w:tabs>
+        <w:ind w:left="2880" w:hanging="360"/>
+      </w:pPr>
+      <w:rPr>
+        <w:rFonts w:ascii="Wingdings" w:hAnsi="Wingdings" w:hint="default"/>
+        <w:sz w:val="20"/>
+      </w:rPr>
+    </w:lvl>
+    <w:lvl w:ilvl="4" w:tentative="1">
+      <w:start w:val="1"/>
+      <w:numFmt w:val="bullet"/>
+      <w:lvlText w:val=""/>
+      <w:lvlJc w:val="left"/>
+      <w:pPr>
+        <w:tabs>
+          <w:tab w:val="num" w:pos="3600"/>
+        </w:tabs>
+        <w:ind w:left="3600" w:hanging="360"/>
+      </w:pPr>
+      <w:rPr>
+        <w:rFonts w:ascii="Wingdings" w:hAnsi="Wingdings" w:hint="default"/>
+        <w:sz w:val="20"/>
+      </w:rPr>
+    </w:lvl>
+    <w:lvl w:ilvl="5" w:tentative="1">
+      <w:start w:val="1"/>
+      <w:numFmt w:val="bullet"/>
+      <w:lvlText w:val=""/>
+      <w:lvlJc w:val="left"/>
+      <w:pPr>
+        <w:tabs>
+          <w:tab w:val="num" w:pos="4320"/>
+        </w:tabs>
+        <w:ind w:left="4320" w:hanging="360"/>
+      </w:pPr>
+      <w:rPr>
+        <w:rFonts w:ascii="Wingdings" w:hAnsi="Wingdings" w:hint="default"/>
+        <w:sz w:val="20"/>
+      </w:rPr>
+    </w:lvl>
+    <w:lvl w:ilvl="6" w:tentative="1">
+      <w:start w:val="1"/>
+      <w:numFmt w:val="bullet"/>
+      <w:lvlText w:val=""/>
+      <w:lvlJc w:val="left"/>
+      <w:pPr>
+        <w:tabs>
+          <w:tab w:val="num" w:pos="5040"/>
+        </w:tabs>
+        <w:ind w:left="5040" w:hanging="360"/>
+      </w:pPr>
+      <w:rPr>
+        <w:rFonts w:ascii="Wingdings" w:hAnsi="Wingdings" w:hint="default"/>
+        <w:sz w:val="20"/>
+      </w:rPr>
+    </w:lvl>
+    <w:lvl w:ilvl="7" w:tentative="1">
+      <w:start w:val="1"/>
+      <w:numFmt w:val="bullet"/>
+      <w:lvlText w:val=""/>
+      <w:lvlJc w:val="left"/>
+      <w:pPr>
+        <w:tabs>
+          <w:tab w:val="num" w:pos="5760"/>
+        </w:tabs>
+        <w:ind w:left="5760" w:hanging="360"/>
+      </w:pPr>
+      <w:rPr>
+        <w:rFonts w:ascii="Wingdings" w:hAnsi="Wingdings" w:hint="default"/>
+        <w:sz w:val="20"/>
+      </w:rPr>
+    </w:lvl>
+    <w:lvl w:ilvl="8" w:tentative="1">
+      <w:start w:val="1"/>
+      <w:numFmt w:val="bullet"/>
+      <w:lvlText w:val=""/>
+      <w:lvlJc w:val="left"/>
+      <w:pPr>
+        <w:tabs>
+          <w:tab w:val="num" w:pos="6480"/>
+        </w:tabs>
+        <w:ind w:left="6480" w:hanging="360"/>
+      </w:pPr>
+      <w:rPr>
+        <w:rFonts w:ascii="Wingdings" w:hAnsi="Wingdings" w:hint="default"/>
+        <w:sz w:val="20"/>
+      </w:rPr>
+    </w:lvl>
+  </w:abstractNum>
+  <w:abstractNum w:abstractNumId="6" w15:restartNumberingAfterBreak="0">
+    <w:nsid w:val="3C56641E"/>
+    <w:multiLevelType w:val="multilevel"/>
+    <w:tmpl w:val="5B16B35A"/>
+    <w:lvl w:ilvl="0">
+      <w:start w:val="1"/>
+      <w:numFmt w:val="bullet"/>
+      <w:lvlText w:val=""/>
+      <w:lvlJc w:val="left"/>
+      <w:pPr>
+        <w:tabs>
+          <w:tab w:val="num" w:pos="720"/>
+        </w:tabs>
+        <w:ind w:left="720" w:hanging="360"/>
+      </w:pPr>
+      <w:rPr>
+        <w:rFonts w:ascii="Symbol" w:hAnsi="Symbol" w:hint="default"/>
+        <w:sz w:val="20"/>
+      </w:rPr>
+    </w:lvl>
+    <w:lvl w:ilvl="1" w:tentative="1">
+      <w:start w:val="1"/>
+      <w:numFmt w:val="bullet"/>
+      <w:lvlText w:val="o"/>
+      <w:lvlJc w:val="left"/>
+      <w:pPr>
+        <w:tabs>
+          <w:tab w:val="num" w:pos="1440"/>
+        </w:tabs>
+        <w:ind w:left="1440" w:hanging="360"/>
+      </w:pPr>
+      <w:rPr>
+        <w:rFonts w:ascii="Courier New" w:hAnsi="Courier New" w:hint="default"/>
+        <w:sz w:val="20"/>
+      </w:rPr>
+    </w:lvl>
+    <w:lvl w:ilvl="2" w:tentative="1">
+      <w:start w:val="1"/>
+      <w:numFmt w:val="bullet"/>
+      <w:lvlText w:val=""/>
+      <w:lvlJc w:val="left"/>
+      <w:pPr>
+        <w:tabs>
+          <w:tab w:val="num" w:pos="2160"/>
+        </w:tabs>
+        <w:ind w:left="2160" w:hanging="360"/>
+      </w:pPr>
+      <w:rPr>
+        <w:rFonts w:ascii="Wingdings" w:hAnsi="Wingdings" w:hint="default"/>
+        <w:sz w:val="20"/>
+      </w:rPr>
+    </w:lvl>
+    <w:lvl w:ilvl="3" w:tentative="1">
+      <w:start w:val="1"/>
+      <w:numFmt w:val="bullet"/>
+      <w:lvlText w:val=""/>
+      <w:lvlJc w:val="left"/>
+      <w:pPr>
+        <w:tabs>
+          <w:tab w:val="num" w:pos="2880"/>
+        </w:tabs>
+        <w:ind w:left="2880" w:hanging="360"/>
+      </w:pPr>
+      <w:rPr>
+        <w:rFonts w:ascii="Wingdings" w:hAnsi="Wingdings" w:hint="default"/>
+        <w:sz w:val="20"/>
+      </w:rPr>
+    </w:lvl>
+    <w:lvl w:ilvl="4" w:tentative="1">
+      <w:start w:val="1"/>
+      <w:numFmt w:val="bullet"/>
+      <w:lvlText w:val=""/>
+      <w:lvlJc w:val="left"/>
+      <w:pPr>
+        <w:tabs>
+          <w:tab w:val="num" w:pos="3600"/>
+        </w:tabs>
+        <w:ind w:left="3600" w:hanging="360"/>
+      </w:pPr>
+      <w:rPr>
+        <w:rFonts w:ascii="Wingdings" w:hAnsi="Wingdings" w:hint="default"/>
+        <w:sz w:val="20"/>
+      </w:rPr>
+    </w:lvl>
+    <w:lvl w:ilvl="5" w:tentative="1">
+      <w:start w:val="1"/>
+      <w:numFmt w:val="bullet"/>
+      <w:lvlText w:val=""/>
+      <w:lvlJc w:val="left"/>
+      <w:pPr>
+        <w:tabs>
+          <w:tab w:val="num" w:pos="4320"/>
+        </w:tabs>
+        <w:ind w:left="4320" w:hanging="360"/>
+      </w:pPr>
+      <w:rPr>
+        <w:rFonts w:ascii="Wingdings" w:hAnsi="Wingdings" w:hint="default"/>
+        <w:sz w:val="20"/>
+      </w:rPr>
+    </w:lvl>
+    <w:lvl w:ilvl="6" w:tentative="1">
+      <w:start w:val="1"/>
+      <w:numFmt w:val="bullet"/>
+      <w:lvlText w:val=""/>
+      <w:lvlJc w:val="left"/>
+      <w:pPr>
+        <w:tabs>
+          <w:tab w:val="num" w:pos="5040"/>
+        </w:tabs>
+        <w:ind w:left="5040" w:hanging="360"/>
+      </w:pPr>
+      <w:rPr>
+        <w:rFonts w:ascii="Wingdings" w:hAnsi="Wingdings" w:hint="default"/>
+        <w:sz w:val="20"/>
+      </w:rPr>
+    </w:lvl>
+    <w:lvl w:ilvl="7" w:tentative="1">
+      <w:start w:val="1"/>
+      <w:numFmt w:val="bullet"/>
+      <w:lvlText w:val=""/>
+      <w:lvlJc w:val="left"/>
+      <w:pPr>
+        <w:tabs>
+          <w:tab w:val="num" w:pos="5760"/>
+        </w:tabs>
+        <w:ind w:left="5760" w:hanging="360"/>
+      </w:pPr>
+      <w:rPr>
+        <w:rFonts w:ascii="Wingdings" w:hAnsi="Wingdings" w:hint="default"/>
+        <w:sz w:val="20"/>
+      </w:rPr>
+    </w:lvl>
+    <w:lvl w:ilvl="8" w:tentative="1">
+      <w:start w:val="1"/>
+      <w:numFmt w:val="bullet"/>
+      <w:lvlText w:val=""/>
+      <w:lvlJc w:val="left"/>
+      <w:pPr>
+        <w:tabs>
+          <w:tab w:val="num" w:pos="6480"/>
+        </w:tabs>
+        <w:ind w:left="6480" w:hanging="360"/>
+      </w:pPr>
+      <w:rPr>
+        <w:rFonts w:ascii="Wingdings" w:hAnsi="Wingdings" w:hint="default"/>
+        <w:sz w:val="20"/>
+      </w:rPr>
+    </w:lvl>
+  </w:abstractNum>
+  <w:abstractNum w:abstractNumId="7" w15:restartNumberingAfterBreak="0">
+    <w:nsid w:val="5C2673AC"/>
+    <w:multiLevelType w:val="multilevel"/>
+    <w:tmpl w:val="BE0C8330"/>
+    <w:lvl w:ilvl="0">
+      <w:start w:val="1"/>
+      <w:numFmt w:val="bullet"/>
+      <w:lvlText w:val=""/>
+      <w:lvlJc w:val="left"/>
+      <w:pPr>
+        <w:tabs>
+          <w:tab w:val="num" w:pos="720"/>
+        </w:tabs>
+        <w:ind w:left="720" w:hanging="360"/>
+      </w:pPr>
+      <w:rPr>
+        <w:rFonts w:ascii="Symbol" w:hAnsi="Symbol" w:hint="default"/>
+        <w:sz w:val="20"/>
+      </w:rPr>
+    </w:lvl>
+    <w:lvl w:ilvl="1">
+      <w:start w:val="1"/>
+      <w:numFmt w:val="bullet"/>
+      <w:lvlText w:val="o"/>
+      <w:lvlJc w:val="left"/>
+      <w:pPr>
+        <w:tabs>
+          <w:tab w:val="num" w:pos="1440"/>
+        </w:tabs>
+        <w:ind w:left="1440" w:hanging="360"/>
+      </w:pPr>
+      <w:rPr>
+        <w:rFonts w:ascii="Courier New" w:hAnsi="Courier New" w:hint="default"/>
+        <w:sz w:val="20"/>
+      </w:rPr>
+    </w:lvl>
+    <w:lvl w:ilvl="2" w:tentative="1">
+      <w:start w:val="1"/>
+      <w:numFmt w:val="bullet"/>
+      <w:lvlText w:val=""/>
+      <w:lvlJc w:val="left"/>
+      <w:pPr>
+        <w:tabs>
+          <w:tab w:val="num" w:pos="2160"/>
+        </w:tabs>
+        <w:ind w:left="2160" w:hanging="360"/>
+      </w:pPr>
+      <w:rPr>
+        <w:rFonts w:ascii="Wingdings" w:hAnsi="Wingdings" w:hint="default"/>
+        <w:sz w:val="20"/>
+      </w:rPr>
+    </w:lvl>
+    <w:lvl w:ilvl="3" w:tentative="1">
+      <w:start w:val="1"/>
+      <w:numFmt w:val="bullet"/>
+      <w:lvlText w:val=""/>
+      <w:lvlJc w:val="left"/>
+      <w:pPr>
+        <w:tabs>
+          <w:tab w:val="num" w:pos="2880"/>
+        </w:tabs>
+        <w:ind w:left="2880" w:hanging="360"/>
+      </w:pPr>
+      <w:rPr>
+        <w:rFonts w:ascii="Wingdings" w:hAnsi="Wingdings" w:hint="default"/>
+        <w:sz w:val="20"/>
+      </w:rPr>
+    </w:lvl>
+    <w:lvl w:ilvl="4" w:tentative="1">
+      <w:start w:val="1"/>
+      <w:numFmt w:val="bullet"/>
+      <w:lvlText w:val=""/>
+      <w:lvlJc w:val="left"/>
+      <w:pPr>
+        <w:tabs>
+          <w:tab w:val="num" w:pos="3600"/>
+        </w:tabs>
+        <w:ind w:left="3600" w:hanging="360"/>
+      </w:pPr>
+      <w:rPr>
+        <w:rFonts w:ascii="Wingdings" w:hAnsi="Wingdings" w:hint="default"/>
+        <w:sz w:val="20"/>
+      </w:rPr>
+    </w:lvl>
+    <w:lvl w:ilvl="5" w:tentative="1">
+      <w:start w:val="1"/>
+      <w:numFmt w:val="bullet"/>
+      <w:lvlText w:val=""/>
+      <w:lvlJc w:val="left"/>
+      <w:pPr>
+        <w:tabs>
+          <w:tab w:val="num" w:pos="4320"/>
+        </w:tabs>
+        <w:ind w:left="4320" w:hanging="360"/>
+      </w:pPr>
+      <w:rPr>
+        <w:rFonts w:ascii="Wingdings" w:hAnsi="Wingdings" w:hint="default"/>
+        <w:sz w:val="20"/>
+      </w:rPr>
+    </w:lvl>
+    <w:lvl w:ilvl="6" w:tentative="1">
+      <w:start w:val="1"/>
+      <w:numFmt w:val="bullet"/>
+      <w:lvlText w:val=""/>
+      <w:lvlJc w:val="left"/>
+      <w:pPr>
+        <w:tabs>
+          <w:tab w:val="num" w:pos="5040"/>
+        </w:tabs>
+        <w:ind w:left="5040" w:hanging="360"/>
+      </w:pPr>
+      <w:rPr>
+        <w:rFonts w:ascii="Wingdings" w:hAnsi="Wingdings" w:hint="default"/>
+        <w:sz w:val="20"/>
+      </w:rPr>
+    </w:lvl>
+    <w:lvl w:ilvl="7" w:tentative="1">
+      <w:start w:val="1"/>
+      <w:numFmt w:val="bullet"/>
+      <w:lvlText w:val=""/>
+      <w:lvlJc w:val="left"/>
+      <w:pPr>
+        <w:tabs>
+          <w:tab w:val="num" w:pos="5760"/>
+        </w:tabs>
+        <w:ind w:left="5760" w:hanging="360"/>
+      </w:pPr>
+      <w:rPr>
+        <w:rFonts w:ascii="Wingdings" w:hAnsi="Wingdings" w:hint="default"/>
+        <w:sz w:val="20"/>
+      </w:rPr>
+    </w:lvl>
+    <w:lvl w:ilvl="8" w:tentative="1">
+      <w:start w:val="1"/>
+      <w:numFmt w:val="bullet"/>
+      <w:lvlText w:val=""/>
+      <w:lvlJc w:val="left"/>
+      <w:pPr>
+        <w:tabs>
+          <w:tab w:val="num" w:pos="6480"/>
+        </w:tabs>
+        <w:ind w:left="6480" w:hanging="360"/>
+      </w:pPr>
+      <w:rPr>
+        <w:rFonts w:ascii="Wingdings" w:hAnsi="Wingdings" w:hint="default"/>
+        <w:sz w:val="20"/>
+      </w:rPr>
+    </w:lvl>
+  </w:abstractNum>
+  <w:abstractNum w:abstractNumId="8" w15:restartNumberingAfterBreak="0">
     <w:nsid w:val="768235F9"/>
     <w:multiLevelType w:val="hybridMultilevel"/>
     <w:tmpl w:val="312A68EA"/>
@@ -768,14 +2941,150 @@
       </w:pPr>
     </w:lvl>
   </w:abstractNum>
+  <w:abstractNum w:abstractNumId="9" w15:restartNumberingAfterBreak="0">
+    <w:nsid w:val="79101F67"/>
+    <w:multiLevelType w:val="hybridMultilevel"/>
+    <w:tmpl w:val="E04C818C"/>
+    <w:lvl w:ilvl="0" w:tplc="C0C4901A">
+      <w:numFmt w:val="bullet"/>
+      <w:lvlText w:val="-"/>
+      <w:lvlJc w:val="left"/>
+      <w:pPr>
+        <w:ind w:left="405" w:hanging="360"/>
+      </w:pPr>
+      <w:rPr>
+        <w:rFonts w:ascii="Times New Roman" w:eastAsia="Times New Roman" w:hAnsi="Times New Roman" w:cs="Times New Roman" w:hint="default"/>
+      </w:rPr>
+    </w:lvl>
+    <w:lvl w:ilvl="1" w:tplc="04090003" w:tentative="1">
+      <w:start w:val="1"/>
+      <w:numFmt w:val="bullet"/>
+      <w:lvlText w:val="o"/>
+      <w:lvlJc w:val="left"/>
+      <w:pPr>
+        <w:ind w:left="1125" w:hanging="360"/>
+      </w:pPr>
+      <w:rPr>
+        <w:rFonts w:ascii="Courier New" w:hAnsi="Courier New" w:cs="Courier New" w:hint="default"/>
+      </w:rPr>
+    </w:lvl>
+    <w:lvl w:ilvl="2" w:tplc="04090005" w:tentative="1">
+      <w:start w:val="1"/>
+      <w:numFmt w:val="bullet"/>
+      <w:lvlText w:val=""/>
+      <w:lvlJc w:val="left"/>
+      <w:pPr>
+        <w:ind w:left="1845" w:hanging="360"/>
+      </w:pPr>
+      <w:rPr>
+        <w:rFonts w:ascii="Wingdings" w:hAnsi="Wingdings" w:hint="default"/>
+      </w:rPr>
+    </w:lvl>
+    <w:lvl w:ilvl="3" w:tplc="04090001" w:tentative="1">
+      <w:start w:val="1"/>
+      <w:numFmt w:val="bullet"/>
+      <w:lvlText w:val=""/>
+      <w:lvlJc w:val="left"/>
+      <w:pPr>
+        <w:ind w:left="2565" w:hanging="360"/>
+      </w:pPr>
+      <w:rPr>
+        <w:rFonts w:ascii="Symbol" w:hAnsi="Symbol" w:hint="default"/>
+      </w:rPr>
+    </w:lvl>
+    <w:lvl w:ilvl="4" w:tplc="04090003" w:tentative="1">
+      <w:start w:val="1"/>
+      <w:numFmt w:val="bullet"/>
+      <w:lvlText w:val="o"/>
+      <w:lvlJc w:val="left"/>
+      <w:pPr>
+        <w:ind w:left="3285" w:hanging="360"/>
+      </w:pPr>
+      <w:rPr>
+        <w:rFonts w:ascii="Courier New" w:hAnsi="Courier New" w:cs="Courier New" w:hint="default"/>
+      </w:rPr>
+    </w:lvl>
+    <w:lvl w:ilvl="5" w:tplc="04090005" w:tentative="1">
+      <w:start w:val="1"/>
+      <w:numFmt w:val="bullet"/>
+      <w:lvlText w:val=""/>
+      <w:lvlJc w:val="left"/>
+      <w:pPr>
+        <w:ind w:left="4005" w:hanging="360"/>
+      </w:pPr>
+      <w:rPr>
+        <w:rFonts w:ascii="Wingdings" w:hAnsi="Wingdings" w:hint="default"/>
+      </w:rPr>
+    </w:lvl>
+    <w:lvl w:ilvl="6" w:tplc="04090001" w:tentative="1">
+      <w:start w:val="1"/>
+      <w:numFmt w:val="bullet"/>
+      <w:lvlText w:val=""/>
+      <w:lvlJc w:val="left"/>
+      <w:pPr>
+        <w:ind w:left="4725" w:hanging="360"/>
+      </w:pPr>
+      <w:rPr>
+        <w:rFonts w:ascii="Symbol" w:hAnsi="Symbol" w:hint="default"/>
+      </w:rPr>
+    </w:lvl>
+    <w:lvl w:ilvl="7" w:tplc="04090003" w:tentative="1">
+      <w:start w:val="1"/>
+      <w:numFmt w:val="bullet"/>
+      <w:lvlText w:val="o"/>
+      <w:lvlJc w:val="left"/>
+      <w:pPr>
+        <w:ind w:left="5445" w:hanging="360"/>
+      </w:pPr>
+      <w:rPr>
+        <w:rFonts w:ascii="Courier New" w:hAnsi="Courier New" w:cs="Courier New" w:hint="default"/>
+      </w:rPr>
+    </w:lvl>
+    <w:lvl w:ilvl="8" w:tplc="04090005" w:tentative="1">
+      <w:start w:val="1"/>
+      <w:numFmt w:val="bullet"/>
+      <w:lvlText w:val=""/>
+      <w:lvlJc w:val="left"/>
+      <w:pPr>
+        <w:ind w:left="6165" w:hanging="360"/>
+      </w:pPr>
+      <w:rPr>
+        <w:rFonts w:ascii="Wingdings" w:hAnsi="Wingdings" w:hint="default"/>
+      </w:rPr>
+    </w:lvl>
+  </w:abstractNum>
   <w:num w:numId="1" w16cid:durableId="1130898365">
-    <w:abstractNumId w:val="1"/>
+    <w:abstractNumId w:val="8"/>
     <w:lvlOverride w:ilvl="0">
       <w:startOverride w:val="1"/>
     </w:lvlOverride>
   </w:num>
   <w:num w:numId="2" w16cid:durableId="5793319">
     <w:abstractNumId w:val="0"/>
+  </w:num>
+  <w:num w:numId="3" w16cid:durableId="271254810">
+    <w:abstractNumId w:val="9"/>
+  </w:num>
+  <w:num w:numId="4" w16cid:durableId="939675955">
+    <w:abstractNumId w:val="3"/>
+  </w:num>
+  <w:num w:numId="5" w16cid:durableId="836118260">
+    <w:abstractNumId w:val="7"/>
+  </w:num>
+  <w:num w:numId="6" w16cid:durableId="1303804003">
+    <w:abstractNumId w:val="1"/>
+  </w:num>
+  <w:num w:numId="7" w16cid:durableId="453645044">
+    <w:abstractNumId w:val="4"/>
+  </w:num>
+  <w:num w:numId="8" w16cid:durableId="385029876">
+    <w:abstractNumId w:val="6"/>
+  </w:num>
+  <w:num w:numId="9" w16cid:durableId="372778473">
+    <w:abstractNumId w:val="5"/>
+  </w:num>
+  <w:num w:numId="10" w16cid:durableId="759986745">
+    <w:abstractNumId w:val="2"/>
   </w:num>
 </w:numbering>
 </file>
@@ -1260,7 +3569,6 @@
   <w:style w:type="character" w:default="1" w:styleId="DefaultParagraphFont">
     <w:name w:val="Default Paragraph Font"/>
     <w:uiPriority w:val="1"/>
-    <w:semiHidden/>
     <w:unhideWhenUsed/>
   </w:style>
   <w:style w:type="table" w:default="1" w:styleId="TableNormal">

</xml_diff>

<commit_message>
Update the site build-out doc
Co-Authored-By: Claude Opus 5 <noreply@anthropic.com>
</commit_message>
<xml_diff>
--- a/Build docs/BestDirectSolutions - Site Build Out.docx
+++ b/Build docs/BestDirectSolutions - Site Build Out.docx
@@ -1,6 +1,6 @@
 
 <file path=word/document.xml><?xml version="1.0" encoding="utf-8"?>
-<w:document xmlns:wpc="http://schemas.microsoft.com/office/word/2010/wordprocessingCanvas" xmlns:cx="http://schemas.microsoft.com/office/drawing/2014/chartex" xmlns:cx1="http://schemas.microsoft.com/office/drawing/2015/9/8/chartex" xmlns:cx2="http://schemas.microsoft.com/office/drawing/2015/10/21/chartex" xmlns:cx3="http://schemas.microsoft.com/office/drawing/2016/5/9/chartex" xmlns:cx4="http://schemas.microsoft.com/office/drawing/2016/5/10/chartex" xmlns:cx5="http://schemas.microsoft.com/office/drawing/2016/5/11/chartex" xmlns:cx6="http://schemas.microsoft.com/office/drawing/2016/5/12/chartex" xmlns:cx7="http://schemas.microsoft.com/office/drawing/2016/5/13/chartex" xmlns:cx8="http://schemas.microsoft.com/office/drawing/2016/5/14/chartex" xmlns:mc="http://schemas.openxmlformats.org/markup-compatibility/2006" xmlns:aink="http://schemas.microsoft.com/office/drawing/2016/ink" xmlns:am3d="http://schemas.microsoft.com/office/drawing/2017/model3d" xmlns:o="urn:schemas-microsoft-com:office:office" xmlns:oel="http://schemas.microsoft.com/office/2019/extlst" xmlns:r="http://schemas.openxmlformats.org/officeDocument/2006/relationships" xmlns:m="http://schemas.openxmlformats.org/officeDocument/2006/math" xmlns:v="urn:schemas-microsoft-com:vml" xmlns:wp14="http://schemas.microsoft.com/office/word/2010/wordprocessingDrawing" xmlns:wp="http://schemas.openxmlformats.org/drawingml/2006/wordprocessingDrawing" xmlns:w10="urn:schemas-microsoft-com:office:word" xmlns:w="http://schemas.openxmlformats.org/wordprocessingml/2006/main" xmlns:w14="http://schemas.microsoft.com/office/word/2010/wordml" xmlns:w15="http://schemas.microsoft.com/office/word/2012/wordml" xmlns:w16cex="http://schemas.microsoft.com/office/word/2018/wordml/cex" xmlns:w16cid="http://schemas.microsoft.com/office/word/2016/wordml/cid" xmlns:w16="http://schemas.microsoft.com/office/word/2018/wordml" xmlns:w16du="http://schemas.microsoft.com/office/word/2023/wordml/word16du" xmlns:w16sdtdh="http://schemas.microsoft.com/office/word/2020/wordml/sdtdatahash" xmlns:w16sdtfl="http://schemas.microsoft.com/office/word/2024/wordml/sdtformatlock" xmlns:w16se="http://schemas.microsoft.com/office/word/2015/wordml/symex" xmlns:wpg="http://schemas.microsoft.com/office/word/2010/wordprocessingGroup" xmlns:wpi="http://schemas.microsoft.com/office/word/2010/wordprocessingInk" xmlns:wne="http://schemas.microsoft.com/office/word/2006/wordml" xmlns:wps="http://schemas.microsoft.com/office/word/2010/wordprocessingShape" mc:Ignorable="w14 w15 w16se w16cid w16 w16cex w16sdtdh w16sdtfl w16du wp14">
+<w:document xmlns:wpc="http://schemas.microsoft.com/office/word/2010/wordprocessingCanvas" xmlns:cx="http://schemas.microsoft.com/office/drawing/2014/chartex" xmlns:cx1="http://schemas.microsoft.com/office/drawing/2015/9/8/chartex" xmlns:cx2="http://schemas.microsoft.com/office/drawing/2015/10/21/chartex" xmlns:cx3="http://schemas.microsoft.com/office/drawing/2016/5/9/chartex" xmlns:cx4="http://schemas.microsoft.com/office/drawing/2016/5/10/chartex" xmlns:cx5="http://schemas.microsoft.com/office/drawing/2016/5/11/chartex" xmlns:cx6="http://schemas.microsoft.com/office/drawing/2016/5/12/chartex" xmlns:cx7="http://schemas.microsoft.com/office/drawing/2016/5/13/chartex" xmlns:cx8="http://schemas.microsoft.com/office/drawing/2016/5/14/chartex" xmlns:mc="http://schemas.openxmlformats.org/markup-compatibility/2006" xmlns:aink="http://schemas.microsoft.com/office/drawing/2016/ink" xmlns:am3d="http://schemas.microsoft.com/office/drawing/2017/model3d" xmlns:o="urn:schemas-microsoft-com:office:office" xmlns:oel="http://schemas.microsoft.com/office/2019/extlst" xmlns:r="http://schemas.openxmlformats.org/officeDocument/2006/relationships" xmlns:m="http://schemas.openxmlformats.org/officeDocument/2006/math" xmlns:v="urn:schemas-microsoft-com:vml" xmlns:wp14="http://schemas.microsoft.com/office/word/2010/wordprocessingDrawing" xmlns:wp="http://schemas.openxmlformats.org/drawingml/2006/wordprocessingDrawing" xmlns:w10="urn:schemas-microsoft-com:office:word" xmlns:w="http://schemas.openxmlformats.org/wordprocessingml/2006/main" xmlns:w14="http://schemas.microsoft.com/office/word/2010/wordml" xmlns:w15="http://schemas.microsoft.com/office/word/2012/wordml" xmlns:w16cei="http://schemas.microsoft.com/office/word/2026/wordml/cei" xmlns:w16cex="http://schemas.microsoft.com/office/word/2018/wordml/cex" xmlns:w16cid="http://schemas.microsoft.com/office/word/2016/wordml/cid" xmlns:w16="http://schemas.microsoft.com/office/word/2018/wordml" xmlns:w16du="http://schemas.microsoft.com/office/word/2023/wordml/word16du" xmlns:w16sdtdh="http://schemas.microsoft.com/office/word/2020/wordml/sdtdatahash" xmlns:w16sdtfl="http://schemas.microsoft.com/office/word/2024/wordml/sdtformatlock" xmlns:w16se="http://schemas.microsoft.com/office/word/2015/wordml/symex" xmlns:wpg="http://schemas.microsoft.com/office/word/2010/wordprocessingGroup" xmlns:wpi="http://schemas.microsoft.com/office/word/2010/wordprocessingInk" xmlns:wne="http://schemas.microsoft.com/office/word/2006/wordml" xmlns:wps="http://schemas.microsoft.com/office/word/2010/wordprocessingShape" mc:Ignorable="w14 w15 w16se w16cid w16 w16cex w16sdtdh w16sdtfl w16du wp14">
   <w:body>
     <w:p>
       <w:pPr>
@@ -249,7 +249,11 @@
         <w:t xml:space="preserve"> | </w:t>
       </w:r>
       <w:r>
-        <w:t>Bestsolutions4you2026</w:t>
+        <w:t>Bestsolutions4you</w:t>
+      </w:r>
+      <w:proofErr w:type="gramStart"/>
+      <w:r>
+        <w:t>2026</w:t>
       </w:r>
       <w:r>
         <w:t xml:space="preserve"> </w:t>
@@ -258,7 +262,14 @@
         <w:rPr>
           <w:color w:val="CC0000"/>
         </w:rPr>
-        <w:t xml:space="preserve"> (placeholder — confirm permanent client email before launch)</w:t>
+        <w:t xml:space="preserve"> (</w:t>
+      </w:r>
+      <w:proofErr w:type="gramEnd"/>
+      <w:r>
+        <w:rPr>
+          <w:color w:val="CC0000"/>
+        </w:rPr>
+        <w:t>placeholder — confirm permanent client email before launch)</w:t>
       </w:r>
     </w:p>
     <w:p>
@@ -485,6 +496,64 @@
           <w:color w:val="CC0000"/>
         </w:rPr>
       </w:pPr>
+      <w:r>
+        <w:rPr>
+          <w:color w:val="CC0000"/>
+        </w:rPr>
+        <w:t xml:space="preserve">ReCAPTCHA: </w:t>
+      </w:r>
+    </w:p>
+    <w:p>
+      <w:pPr>
+        <w:rPr>
+          <w:color w:val="CC0000"/>
+        </w:rPr>
+      </w:pPr>
+      <w:r>
+        <w:rPr>
+          <w:color w:val="CC0000"/>
+        </w:rPr>
+        <w:t xml:space="preserve">Site Key: </w:t>
+      </w:r>
+      <w:r>
+        <w:rPr>
+          <w:color w:val="CC0000"/>
+        </w:rPr>
+        <w:t>6Lem1GotAAAAAPeLj6lrGHc5BwLPGK7WfnFWmTO1</w:t>
+      </w:r>
+    </w:p>
+    <w:p>
+      <w:pPr>
+        <w:rPr>
+          <w:color w:val="CC0000"/>
+        </w:rPr>
+      </w:pPr>
+      <w:r>
+        <w:rPr>
+          <w:color w:val="CC0000"/>
+        </w:rPr>
+        <w:t xml:space="preserve">Secret Key: </w:t>
+      </w:r>
+      <w:r>
+        <w:rPr>
+          <w:color w:val="CC0000"/>
+        </w:rPr>
+        <w:t>6Lem1GotAAAAAC6Kg77-SkuW9d5N11mnrIwP_ZC_</w:t>
+      </w:r>
+    </w:p>
+    <w:p>
+      <w:pPr>
+        <w:rPr>
+          <w:color w:val="CC0000"/>
+        </w:rPr>
+      </w:pPr>
+    </w:p>
+    <w:p>
+      <w:pPr>
+        <w:rPr>
+          <w:color w:val="CC0000"/>
+        </w:rPr>
+      </w:pPr>
     </w:p>
     <w:p>
       <w:pPr>
@@ -1402,6 +1471,7 @@
         <w:rPr>
           <w:color w:val="CC0000"/>
         </w:rPr>
+        <w:lastRenderedPageBreak/>
         <w:t xml:space="preserve">Publishing new changes </w:t>
       </w:r>
     </w:p>
@@ -1474,7 +1544,6 @@
         <w:rPr>
           <w:color w:val="CC0000"/>
         </w:rPr>
-        <w:lastRenderedPageBreak/>
         <w:t xml:space="preserve">Billing and payment settings </w:t>
       </w:r>
     </w:p>
@@ -1698,7 +1767,7 @@
 </file>
 
 <file path=word/numbering.xml><?xml version="1.0" encoding="utf-8"?>
-<w:numbering xmlns:wpc="http://schemas.microsoft.com/office/word/2010/wordprocessingCanvas" xmlns:cx="http://schemas.microsoft.com/office/drawing/2014/chartex" xmlns:cx1="http://schemas.microsoft.com/office/drawing/2015/9/8/chartex" xmlns:cx2="http://schemas.microsoft.com/office/drawing/2015/10/21/chartex" xmlns:cx3="http://schemas.microsoft.com/office/drawing/2016/5/9/chartex" xmlns:cx4="http://schemas.microsoft.com/office/drawing/2016/5/10/chartex" xmlns:cx5="http://schemas.microsoft.com/office/drawing/2016/5/11/chartex" xmlns:cx6="http://schemas.microsoft.com/office/drawing/2016/5/12/chartex" xmlns:cx7="http://schemas.microsoft.com/office/drawing/2016/5/13/chartex" xmlns:cx8="http://schemas.microsoft.com/office/drawing/2016/5/14/chartex" xmlns:mc="http://schemas.openxmlformats.org/markup-compatibility/2006" xmlns:aink="http://schemas.microsoft.com/office/drawing/2016/ink" xmlns:am3d="http://schemas.microsoft.com/office/drawing/2017/model3d" xmlns:o="urn:schemas-microsoft-com:office:office" xmlns:oel="http://schemas.microsoft.com/office/2019/extlst" xmlns:r="http://schemas.openxmlformats.org/officeDocument/2006/relationships" xmlns:m="http://schemas.openxmlformats.org/officeDocument/2006/math" xmlns:v="urn:schemas-microsoft-com:vml" xmlns:wp14="http://schemas.microsoft.com/office/word/2010/wordprocessingDrawing" xmlns:wp="http://schemas.openxmlformats.org/drawingml/2006/wordprocessingDrawing" xmlns:w10="urn:schemas-microsoft-com:office:word" xmlns:w="http://schemas.openxmlformats.org/wordprocessingml/2006/main" xmlns:w14="http://schemas.microsoft.com/office/word/2010/wordml" xmlns:w15="http://schemas.microsoft.com/office/word/2012/wordml" xmlns:w16cex="http://schemas.microsoft.com/office/word/2018/wordml/cex" xmlns:w16cid="http://schemas.microsoft.com/office/word/2016/wordml/cid" xmlns:w16="http://schemas.microsoft.com/office/word/2018/wordml" xmlns:w16du="http://schemas.microsoft.com/office/word/2023/wordml/word16du" xmlns:w16sdtdh="http://schemas.microsoft.com/office/word/2020/wordml/sdtdatahash" xmlns:w16sdtfl="http://schemas.microsoft.com/office/word/2024/wordml/sdtformatlock" xmlns:w16se="http://schemas.microsoft.com/office/word/2015/wordml/symex" xmlns:wpg="http://schemas.microsoft.com/office/word/2010/wordprocessingGroup" xmlns:wpi="http://schemas.microsoft.com/office/word/2010/wordprocessingInk" xmlns:wne="http://schemas.microsoft.com/office/word/2006/wordml" xmlns:wps="http://schemas.microsoft.com/office/word/2010/wordprocessingShape" mc:Ignorable="w14 w15 w16se w16cid w16 w16cex w16sdtdh w16sdtfl w16du wp14">
+<w:numbering xmlns:wpc="http://schemas.microsoft.com/office/word/2010/wordprocessingCanvas" xmlns:cx="http://schemas.microsoft.com/office/drawing/2014/chartex" xmlns:cx1="http://schemas.microsoft.com/office/drawing/2015/9/8/chartex" xmlns:cx2="http://schemas.microsoft.com/office/drawing/2015/10/21/chartex" xmlns:cx3="http://schemas.microsoft.com/office/drawing/2016/5/9/chartex" xmlns:cx4="http://schemas.microsoft.com/office/drawing/2016/5/10/chartex" xmlns:cx5="http://schemas.microsoft.com/office/drawing/2016/5/11/chartex" xmlns:cx6="http://schemas.microsoft.com/office/drawing/2016/5/12/chartex" xmlns:cx7="http://schemas.microsoft.com/office/drawing/2016/5/13/chartex" xmlns:cx8="http://schemas.microsoft.com/office/drawing/2016/5/14/chartex" xmlns:mc="http://schemas.openxmlformats.org/markup-compatibility/2006" xmlns:aink="http://schemas.microsoft.com/office/drawing/2016/ink" xmlns:am3d="http://schemas.microsoft.com/office/drawing/2017/model3d" xmlns:o="urn:schemas-microsoft-com:office:office" xmlns:oel="http://schemas.microsoft.com/office/2019/extlst" xmlns:r="http://schemas.openxmlformats.org/officeDocument/2006/relationships" xmlns:m="http://schemas.openxmlformats.org/officeDocument/2006/math" xmlns:v="urn:schemas-microsoft-com:vml" xmlns:wp14="http://schemas.microsoft.com/office/word/2010/wordprocessingDrawing" xmlns:wp="http://schemas.openxmlformats.org/drawingml/2006/wordprocessingDrawing" xmlns:w10="urn:schemas-microsoft-com:office:word" xmlns:w="http://schemas.openxmlformats.org/wordprocessingml/2006/main" xmlns:w14="http://schemas.microsoft.com/office/word/2010/wordml" xmlns:w15="http://schemas.microsoft.com/office/word/2012/wordml" xmlns:w16cei="http://schemas.microsoft.com/office/word/2026/wordml/cei" xmlns:w16cex="http://schemas.microsoft.com/office/word/2018/wordml/cex" xmlns:w16cid="http://schemas.microsoft.com/office/word/2016/wordml/cid" xmlns:w16="http://schemas.microsoft.com/office/word/2018/wordml" xmlns:w16du="http://schemas.microsoft.com/office/word/2023/wordml/word16du" xmlns:w16sdtdh="http://schemas.microsoft.com/office/word/2020/wordml/sdtdatahash" xmlns:w16sdtfl="http://schemas.microsoft.com/office/word/2024/wordml/sdtformatlock" xmlns:w16se="http://schemas.microsoft.com/office/word/2015/wordml/symex" xmlns:wpg="http://schemas.microsoft.com/office/word/2010/wordprocessingGroup" xmlns:wpi="http://schemas.microsoft.com/office/word/2010/wordprocessingInk" xmlns:wne="http://schemas.microsoft.com/office/word/2006/wordml" xmlns:wps="http://schemas.microsoft.com/office/word/2010/wordprocessingShape" mc:Ignorable="w14 w15 w16se w16cid w16 w16cex w16sdtdh w16sdtfl w16du wp14">
   <w:abstractNum w:abstractNumId="0" w15:restartNumberingAfterBreak="0">
     <w:nsid w:val="00FC6673"/>
     <w:multiLevelType w:val="hybridMultilevel"/>

</xml_diff>